<commit_message>
Paper v3: keystone consensus (5.4) and predictors-of-gain (5.5) sections, BH and HC3 formulas, 2 new negatives, tools table from ledger; pdfinfo 23 pages
</commit_message>
<xml_diff>
--- a/paper/mega27-04-microbiome-twin-paper.docx
+++ b/paper/mega27-04-microbiome-twin-paper.docx
@@ -4639,6 +4639,1099 @@
     </w:p>
     <w:p>
       <w:pPr>
+        <w:pStyle w:val="Heading2"/>
+      </w:pPr>
+      <w:r>
+        <w:t>5.4 Keystone consensus across studies (exploratory)</w:t>
+      </w:r>
+    </w:p>
+    <w:p>
+      <w:pPr>
+        <w:spacing w:after="120"/>
+        <w:jc w:val="both"/>
+      </w:pPr>
+      <w:r>
+        <w:t>For each MGnify study we fitted the ridge interaction model on all samples, built a directed networkx graph with edge weight |W_ij|, and scored each genus by weighted out-strength. A genus is 'top' in a study if it is in that study's top 10%. Across studies we test the top count against the 10% expectation with a one-sided binomial test and control the false discovery rate (Benjamini-Hochberg):</w:t>
+      </w:r>
+    </w:p>
+    <w:p>
+      <w:pPr>
+        <w:jc w:val="center"/>
+      </w:pPr>
+      <w:r>
+        <w:rPr>
+          <w:i/>
+        </w:rPr>
+        <w:t>s_j = sum_i |W_ij|,   p_j = P(Binom(n_j, 0.1) &gt;= k_j),   q_(r) = min_{r' &gt;= r} ( m p_(r') / r' )</w:t>
+      </w:r>
+      <w:r>
+        <w:tab/>
+        <w:tab/>
+        <w:t>(15)</w:t>
+      </w:r>
+    </w:p>
+    <w:p>
+      <w:r>
+        <w:rPr>
+          <w:b/>
+        </w:rPr>
+        <w:t>Table 7. Top genera by keystone consensus (248 genera modelled in &gt;= 20 studies; results/keystone_consensus.csv).</w:t>
+      </w:r>
+    </w:p>
+    <w:tbl>
+      <w:tblPr>
+        <w:tblStyle w:val="LightGrid-Accent1"/>
+        <w:tblW w:type="auto" w:w="0"/>
+        <w:tblLook w:firstColumn="1" w:firstRow="1" w:lastColumn="0" w:lastRow="0" w:noHBand="0" w:noVBand="1" w:val="04A0"/>
+      </w:tblPr>
+      <w:tblGrid>
+        <w:gridCol w:w="1440"/>
+        <w:gridCol w:w="1440"/>
+        <w:gridCol w:w="1440"/>
+        <w:gridCol w:w="1440"/>
+        <w:gridCol w:w="1440"/>
+        <w:gridCol w:w="1440"/>
+      </w:tblGrid>
+      <w:tr>
+        <w:tc>
+          <w:tcPr>
+            <w:tcW w:type="dxa" w:w="1440"/>
+          </w:tcPr>
+          <w:p>
+            <w:r>
+              <w:t>genus</w:t>
+            </w:r>
+          </w:p>
+        </w:tc>
+        <w:tc>
+          <w:tcPr>
+            <w:tcW w:type="dxa" w:w="1440"/>
+          </w:tcPr>
+          <w:p>
+            <w:r>
+              <w:t>studies</w:t>
+            </w:r>
+          </w:p>
+        </w:tc>
+        <w:tc>
+          <w:tcPr>
+            <w:tcW w:type="dxa" w:w="1440"/>
+          </w:tcPr>
+          <w:p>
+            <w:r>
+              <w:t>top</w:t>
+            </w:r>
+          </w:p>
+        </w:tc>
+        <w:tc>
+          <w:tcPr>
+            <w:tcW w:type="dxa" w:w="1440"/>
+          </w:tcPr>
+          <w:p>
+            <w:r>
+              <w:t>fraction top</w:t>
+            </w:r>
+          </w:p>
+        </w:tc>
+        <w:tc>
+          <w:tcPr>
+            <w:tcW w:type="dxa" w:w="1440"/>
+          </w:tcPr>
+          <w:p>
+            <w:r>
+              <w:t>p</w:t>
+            </w:r>
+          </w:p>
+        </w:tc>
+        <w:tc>
+          <w:tcPr>
+            <w:tcW w:type="dxa" w:w="1440"/>
+          </w:tcPr>
+          <w:p>
+            <w:r>
+              <w:t>q (BH)</w:t>
+            </w:r>
+          </w:p>
+        </w:tc>
+      </w:tr>
+      <w:tr>
+        <w:tc>
+          <w:tcPr>
+            <w:tcW w:type="dxa" w:w="1440"/>
+          </w:tcPr>
+          <w:p>
+            <w:r>
+              <w:t>Cardiobacterium</w:t>
+            </w:r>
+          </w:p>
+        </w:tc>
+        <w:tc>
+          <w:tcPr>
+            <w:tcW w:type="dxa" w:w="1440"/>
+          </w:tcPr>
+          <w:p>
+            <w:r>
+              <w:t>30</w:t>
+            </w:r>
+          </w:p>
+        </w:tc>
+        <w:tc>
+          <w:tcPr>
+            <w:tcW w:type="dxa" w:w="1440"/>
+          </w:tcPr>
+          <w:p>
+            <w:r>
+              <w:t>13</w:t>
+            </w:r>
+          </w:p>
+        </w:tc>
+        <w:tc>
+          <w:tcPr>
+            <w:tcW w:type="dxa" w:w="1440"/>
+          </w:tcPr>
+          <w:p>
+            <w:r>
+              <w:t>0.433</w:t>
+            </w:r>
+          </w:p>
+        </w:tc>
+        <w:tc>
+          <w:tcPr>
+            <w:tcW w:type="dxa" w:w="1440"/>
+          </w:tcPr>
+          <w:p>
+            <w:r>
+              <w:t>2.3e-06</w:t>
+            </w:r>
+          </w:p>
+        </w:tc>
+        <w:tc>
+          <w:tcPr>
+            <w:tcW w:type="dxa" w:w="1440"/>
+          </w:tcPr>
+          <w:p>
+            <w:r>
+              <w:t>0.00057</w:t>
+            </w:r>
+          </w:p>
+        </w:tc>
+      </w:tr>
+      <w:tr>
+        <w:tc>
+          <w:tcPr>
+            <w:tcW w:type="dxa" w:w="1440"/>
+          </w:tcPr>
+          <w:p>
+            <w:r>
+              <w:t>Eikenella</w:t>
+            </w:r>
+          </w:p>
+        </w:tc>
+        <w:tc>
+          <w:tcPr>
+            <w:tcW w:type="dxa" w:w="1440"/>
+          </w:tcPr>
+          <w:p>
+            <w:r>
+              <w:t>28</w:t>
+            </w:r>
+          </w:p>
+        </w:tc>
+        <w:tc>
+          <w:tcPr>
+            <w:tcW w:type="dxa" w:w="1440"/>
+          </w:tcPr>
+          <w:p>
+            <w:r>
+              <w:t>11</w:t>
+            </w:r>
+          </w:p>
+        </w:tc>
+        <w:tc>
+          <w:tcPr>
+            <w:tcW w:type="dxa" w:w="1440"/>
+          </w:tcPr>
+          <w:p>
+            <w:r>
+              <w:t>0.393</w:t>
+            </w:r>
+          </w:p>
+        </w:tc>
+        <w:tc>
+          <w:tcPr>
+            <w:tcW w:type="dxa" w:w="1440"/>
+          </w:tcPr>
+          <w:p>
+            <w:r>
+              <w:t>4.2e-05</w:t>
+            </w:r>
+          </w:p>
+        </w:tc>
+        <w:tc>
+          <w:tcPr>
+            <w:tcW w:type="dxa" w:w="1440"/>
+          </w:tcPr>
+          <w:p>
+            <w:r>
+              <w:t>0.0052</w:t>
+            </w:r>
+          </w:p>
+        </w:tc>
+      </w:tr>
+      <w:tr>
+        <w:tc>
+          <w:tcPr>
+            <w:tcW w:type="dxa" w:w="1440"/>
+          </w:tcPr>
+          <w:p>
+            <w:r>
+              <w:t>Comamonas</w:t>
+            </w:r>
+          </w:p>
+        </w:tc>
+        <w:tc>
+          <w:tcPr>
+            <w:tcW w:type="dxa" w:w="1440"/>
+          </w:tcPr>
+          <w:p>
+            <w:r>
+              <w:t>51</w:t>
+            </w:r>
+          </w:p>
+        </w:tc>
+        <w:tc>
+          <w:tcPr>
+            <w:tcW w:type="dxa" w:w="1440"/>
+          </w:tcPr>
+          <w:p>
+            <w:r>
+              <w:t>13</w:t>
+            </w:r>
+          </w:p>
+        </w:tc>
+        <w:tc>
+          <w:tcPr>
+            <w:tcW w:type="dxa" w:w="1440"/>
+          </w:tcPr>
+          <w:p>
+            <w:r>
+              <w:t>0.255</w:t>
+            </w:r>
+          </w:p>
+        </w:tc>
+        <w:tc>
+          <w:tcPr>
+            <w:tcW w:type="dxa" w:w="1440"/>
+          </w:tcPr>
+          <w:p>
+            <w:r>
+              <w:t>1.2e-03</w:t>
+            </w:r>
+          </w:p>
+        </w:tc>
+        <w:tc>
+          <w:tcPr>
+            <w:tcW w:type="dxa" w:w="1440"/>
+          </w:tcPr>
+          <w:p>
+            <w:r>
+              <w:t>0.099</w:t>
+            </w:r>
+          </w:p>
+        </w:tc>
+      </w:tr>
+      <w:tr>
+        <w:tc>
+          <w:tcPr>
+            <w:tcW w:type="dxa" w:w="1440"/>
+          </w:tcPr>
+          <w:p>
+            <w:r>
+              <w:t>Johnsonella</w:t>
+            </w:r>
+          </w:p>
+        </w:tc>
+        <w:tc>
+          <w:tcPr>
+            <w:tcW w:type="dxa" w:w="1440"/>
+          </w:tcPr>
+          <w:p>
+            <w:r>
+              <w:t>35</w:t>
+            </w:r>
+          </w:p>
+        </w:tc>
+        <w:tc>
+          <w:tcPr>
+            <w:tcW w:type="dxa" w:w="1440"/>
+          </w:tcPr>
+          <w:p>
+            <w:r>
+              <w:t>10</w:t>
+            </w:r>
+          </w:p>
+        </w:tc>
+        <w:tc>
+          <w:tcPr>
+            <w:tcW w:type="dxa" w:w="1440"/>
+          </w:tcPr>
+          <w:p>
+            <w:r>
+              <w:t>0.286</w:t>
+            </w:r>
+          </w:p>
+        </w:tc>
+        <w:tc>
+          <w:tcPr>
+            <w:tcW w:type="dxa" w:w="1440"/>
+          </w:tcPr>
+          <w:p>
+            <w:r>
+              <w:t>1.7e-03</w:t>
+            </w:r>
+          </w:p>
+        </w:tc>
+        <w:tc>
+          <w:tcPr>
+            <w:tcW w:type="dxa" w:w="1440"/>
+          </w:tcPr>
+          <w:p>
+            <w:r>
+              <w:t>0.099</w:t>
+            </w:r>
+          </w:p>
+        </w:tc>
+      </w:tr>
+      <w:tr>
+        <w:tc>
+          <w:tcPr>
+            <w:tcW w:type="dxa" w:w="1440"/>
+          </w:tcPr>
+          <w:p>
+            <w:r>
+              <w:t>Simonsiella</w:t>
+            </w:r>
+          </w:p>
+        </w:tc>
+        <w:tc>
+          <w:tcPr>
+            <w:tcW w:type="dxa" w:w="1440"/>
+          </w:tcPr>
+          <w:p>
+            <w:r>
+              <w:t>20</w:t>
+            </w:r>
+          </w:p>
+        </w:tc>
+        <w:tc>
+          <w:tcPr>
+            <w:tcW w:type="dxa" w:w="1440"/>
+          </w:tcPr>
+          <w:p>
+            <w:r>
+              <w:t>7</w:t>
+            </w:r>
+          </w:p>
+        </w:tc>
+        <w:tc>
+          <w:tcPr>
+            <w:tcW w:type="dxa" w:w="1440"/>
+          </w:tcPr>
+          <w:p>
+            <w:r>
+              <w:t>0.350</w:t>
+            </w:r>
+          </w:p>
+        </w:tc>
+        <w:tc>
+          <w:tcPr>
+            <w:tcW w:type="dxa" w:w="1440"/>
+          </w:tcPr>
+          <w:p>
+            <w:r>
+              <w:t>2.4e-03</w:t>
+            </w:r>
+          </w:p>
+        </w:tc>
+        <w:tc>
+          <w:tcPr>
+            <w:tcW w:type="dxa" w:w="1440"/>
+          </w:tcPr>
+          <w:p>
+            <w:r>
+              <w:t>0.099</w:t>
+            </w:r>
+          </w:p>
+        </w:tc>
+      </w:tr>
+      <w:tr>
+        <w:tc>
+          <w:tcPr>
+            <w:tcW w:type="dxa" w:w="1440"/>
+          </w:tcPr>
+          <w:p>
+            <w:r>
+              <w:t>Desulfobulbus</w:t>
+            </w:r>
+          </w:p>
+        </w:tc>
+        <w:tc>
+          <w:tcPr>
+            <w:tcW w:type="dxa" w:w="1440"/>
+          </w:tcPr>
+          <w:p>
+            <w:r>
+              <w:t>20</w:t>
+            </w:r>
+          </w:p>
+        </w:tc>
+        <w:tc>
+          <w:tcPr>
+            <w:tcW w:type="dxa" w:w="1440"/>
+          </w:tcPr>
+          <w:p>
+            <w:r>
+              <w:t>7</w:t>
+            </w:r>
+          </w:p>
+        </w:tc>
+        <w:tc>
+          <w:tcPr>
+            <w:tcW w:type="dxa" w:w="1440"/>
+          </w:tcPr>
+          <w:p>
+            <w:r>
+              <w:t>0.350</w:t>
+            </w:r>
+          </w:p>
+        </w:tc>
+        <w:tc>
+          <w:tcPr>
+            <w:tcW w:type="dxa" w:w="1440"/>
+          </w:tcPr>
+          <w:p>
+            <w:r>
+              <w:t>2.4e-03</w:t>
+            </w:r>
+          </w:p>
+        </w:tc>
+        <w:tc>
+          <w:tcPr>
+            <w:tcW w:type="dxa" w:w="1440"/>
+          </w:tcPr>
+          <w:p>
+            <w:r>
+              <w:t>0.099</w:t>
+            </w:r>
+          </w:p>
+        </w:tc>
+      </w:tr>
+      <w:tr>
+        <w:tc>
+          <w:tcPr>
+            <w:tcW w:type="dxa" w:w="1440"/>
+          </w:tcPr>
+          <w:p>
+            <w:r>
+              <w:t>Sutterella</w:t>
+            </w:r>
+          </w:p>
+        </w:tc>
+        <w:tc>
+          <w:tcPr>
+            <w:tcW w:type="dxa" w:w="1440"/>
+          </w:tcPr>
+          <w:p>
+            <w:r>
+              <w:t>56</w:t>
+            </w:r>
+          </w:p>
+        </w:tc>
+        <w:tc>
+          <w:tcPr>
+            <w:tcW w:type="dxa" w:w="1440"/>
+          </w:tcPr>
+          <w:p>
+            <w:r>
+              <w:t>13</w:t>
+            </w:r>
+          </w:p>
+        </w:tc>
+        <w:tc>
+          <w:tcPr>
+            <w:tcW w:type="dxa" w:w="1440"/>
+          </w:tcPr>
+          <w:p>
+            <w:r>
+              <w:t>0.232</w:t>
+            </w:r>
+          </w:p>
+        </w:tc>
+        <w:tc>
+          <w:tcPr>
+            <w:tcW w:type="dxa" w:w="1440"/>
+          </w:tcPr>
+          <w:p>
+            <w:r>
+              <w:t>3.0e-03</w:t>
+            </w:r>
+          </w:p>
+        </w:tc>
+        <w:tc>
+          <w:tcPr>
+            <w:tcW w:type="dxa" w:w="1440"/>
+          </w:tcPr>
+          <w:p>
+            <w:r>
+              <w:t>0.11</w:t>
+            </w:r>
+          </w:p>
+        </w:tc>
+      </w:tr>
+    </w:tbl>
+    <w:p>
+      <w:pPr>
+        <w:spacing w:after="120"/>
+        <w:jc w:val="both"/>
+      </w:pPr>
+      <w:r>
+        <w:t>Two genera pass FDR &lt; 0.05: Cardiobacterium and Eikenella. Both are oral HACEK genera, so the signal most likely reflects the oral studies, where interaction models fit best. It is not a cross-biome keystone law. Out-strength from a ridge model is a statistical dependence score, not a causal keystone effect, and it scales with each genus's variance and prevalence. No experimental validation was done.</w:t>
+      </w:r>
+    </w:p>
+    <w:p>
+      <w:pPr>
+        <w:pStyle w:val="Heading2"/>
+      </w:pPr>
+      <w:r>
+        <w:t>5.5 What predicts where interactions help?</w:t>
+      </w:r>
+    </w:p>
+    <w:p>
+      <w:pPr>
+        <w:spacing w:after="120"/>
+        <w:jc w:val="both"/>
+      </w:pPr>
+      <w:r>
+        <w:t>Across the 160 studies we regressed the audit gain (prior error minus interaction error) on standardised study covariates: Shannon diversity and Bray-Curtis dispersion (scikit-bio), co-occurrence network density and modularity (networkx; edges where |Spearman rho| &gt; 0.3 among genera with prevalence &gt;= 20%), log sample and taxa counts, and assembly and human-gut flags. Inference uses heteroskedasticity-robust (HC3) standard errors:</w:t>
+      </w:r>
+    </w:p>
+    <w:p>
+      <w:pPr>
+        <w:jc w:val="center"/>
+      </w:pPr>
+      <w:r>
+        <w:rPr>
+          <w:i/>
+        </w:rPr>
+        <w:t>gain_s = b_0 + sum_k b_k z_sk + e_s,   Var(b) = (Z'Z)^-1 Z' diag( e_s^2 / (1 - h_ss)^2 ) Z (Z'Z)^-1</w:t>
+      </w:r>
+      <w:r>
+        <w:tab/>
+        <w:tab/>
+        <w:t>(16)</w:t>
+      </w:r>
+    </w:p>
+    <w:p>
+      <w:r>
+        <w:rPr>
+          <w:b/>
+        </w:rPr>
+        <w:t>Table 8. Predictors of interaction gain (OLS R^2 = 0.47; random forest 5-fold CV R^2 = 0.37; results/predictors_audit.json).</w:t>
+      </w:r>
+    </w:p>
+    <w:tbl>
+      <w:tblPr>
+        <w:tblStyle w:val="LightGrid-Accent1"/>
+        <w:tblW w:type="auto" w:w="0"/>
+        <w:tblLook w:firstColumn="1" w:firstRow="1" w:lastColumn="0" w:lastRow="0" w:noHBand="0" w:noVBand="1" w:val="04A0"/>
+      </w:tblPr>
+      <w:tblGrid>
+        <w:gridCol w:w="1728"/>
+        <w:gridCol w:w="1728"/>
+        <w:gridCol w:w="1728"/>
+        <w:gridCol w:w="1728"/>
+        <w:gridCol w:w="1728"/>
+      </w:tblGrid>
+      <w:tr>
+        <w:tc>
+          <w:tcPr>
+            <w:tcW w:type="dxa" w:w="1728"/>
+          </w:tcPr>
+          <w:p>
+            <w:r>
+              <w:t>covariate</w:t>
+            </w:r>
+          </w:p>
+        </w:tc>
+        <w:tc>
+          <w:tcPr>
+            <w:tcW w:type="dxa" w:w="1728"/>
+          </w:tcPr>
+          <w:p>
+            <w:r>
+              <w:t>std. beta</w:t>
+            </w:r>
+          </w:p>
+        </w:tc>
+        <w:tc>
+          <w:tcPr>
+            <w:tcW w:type="dxa" w:w="1728"/>
+          </w:tcPr>
+          <w:p>
+            <w:r>
+              <w:t>p (HC3)</w:t>
+            </w:r>
+          </w:p>
+        </w:tc>
+        <w:tc>
+          <w:tcPr>
+            <w:tcW w:type="dxa" w:w="1728"/>
+          </w:tcPr>
+          <w:p>
+            <w:r>
+              <w:t>RF permutation importance</w:t>
+            </w:r>
+          </w:p>
+        </w:tc>
+        <w:tc>
+          <w:tcPr>
+            <w:tcW w:type="dxa" w:w="1728"/>
+          </w:tcPr>
+          <w:p>
+            <w:r>
+              <w:t>marginal Spearman rho</w:t>
+            </w:r>
+          </w:p>
+        </w:tc>
+      </w:tr>
+      <w:tr>
+        <w:tc>
+          <w:tcPr>
+            <w:tcW w:type="dxa" w:w="1728"/>
+          </w:tcPr>
+          <w:p>
+            <w:r>
+              <w:t>shannon</w:t>
+            </w:r>
+          </w:p>
+        </w:tc>
+        <w:tc>
+          <w:tcPr>
+            <w:tcW w:type="dxa" w:w="1728"/>
+          </w:tcPr>
+          <w:p>
+            <w:r>
+              <w:t>-0.003</w:t>
+            </w:r>
+          </w:p>
+        </w:tc>
+        <w:tc>
+          <w:tcPr>
+            <w:tcW w:type="dxa" w:w="1728"/>
+          </w:tcPr>
+          <w:p>
+            <w:r>
+              <w:t>0.63</w:t>
+            </w:r>
+          </w:p>
+        </w:tc>
+        <w:tc>
+          <w:tcPr>
+            <w:tcW w:type="dxa" w:w="1728"/>
+          </w:tcPr>
+          <w:p>
+            <w:r>
+              <w:t>0.039</w:t>
+            </w:r>
+          </w:p>
+        </w:tc>
+        <w:tc>
+          <w:tcPr>
+            <w:tcW w:type="dxa" w:w="1728"/>
+          </w:tcPr>
+          <w:p>
+            <w:r>
+              <w:t>-0.350</w:t>
+            </w:r>
+          </w:p>
+        </w:tc>
+      </w:tr>
+      <w:tr>
+        <w:tc>
+          <w:tcPr>
+            <w:tcW w:type="dxa" w:w="1728"/>
+          </w:tcPr>
+          <w:p>
+            <w:r>
+              <w:t>beta_bc</w:t>
+            </w:r>
+          </w:p>
+        </w:tc>
+        <w:tc>
+          <w:tcPr>
+            <w:tcW w:type="dxa" w:w="1728"/>
+          </w:tcPr>
+          <w:p>
+            <w:r>
+              <w:t>0.014</w:t>
+            </w:r>
+          </w:p>
+        </w:tc>
+        <w:tc>
+          <w:tcPr>
+            <w:tcW w:type="dxa" w:w="1728"/>
+          </w:tcPr>
+          <w:p>
+            <w:r>
+              <w:t>0.0051</w:t>
+            </w:r>
+          </w:p>
+        </w:tc>
+        <w:tc>
+          <w:tcPr>
+            <w:tcW w:type="dxa" w:w="1728"/>
+          </w:tcPr>
+          <w:p>
+            <w:r>
+              <w:t>0.268</w:t>
+            </w:r>
+          </w:p>
+        </w:tc>
+        <w:tc>
+          <w:tcPr>
+            <w:tcW w:type="dxa" w:w="1728"/>
+          </w:tcPr>
+          <w:p>
+            <w:r>
+              <w:t>0.510</w:t>
+            </w:r>
+          </w:p>
+        </w:tc>
+      </w:tr>
+      <w:tr>
+        <w:tc>
+          <w:tcPr>
+            <w:tcW w:type="dxa" w:w="1728"/>
+          </w:tcPr>
+          <w:p>
+            <w:r>
+              <w:t>net_density</w:t>
+            </w:r>
+          </w:p>
+        </w:tc>
+        <w:tc>
+          <w:tcPr>
+            <w:tcW w:type="dxa" w:w="1728"/>
+          </w:tcPr>
+          <w:p>
+            <w:r>
+              <w:t>0.026</w:t>
+            </w:r>
+          </w:p>
+        </w:tc>
+        <w:tc>
+          <w:tcPr>
+            <w:tcW w:type="dxa" w:w="1728"/>
+          </w:tcPr>
+          <w:p>
+            <w:r>
+              <w:t>0.00076</w:t>
+            </w:r>
+          </w:p>
+        </w:tc>
+        <w:tc>
+          <w:tcPr>
+            <w:tcW w:type="dxa" w:w="1728"/>
+          </w:tcPr>
+          <w:p>
+            <w:r>
+              <w:t>0.600</w:t>
+            </w:r>
+          </w:p>
+        </w:tc>
+        <w:tc>
+          <w:tcPr>
+            <w:tcW w:type="dxa" w:w="1728"/>
+          </w:tcPr>
+          <w:p>
+            <w:r>
+              <w:t>0.610</w:t>
+            </w:r>
+          </w:p>
+        </w:tc>
+      </w:tr>
+      <w:tr>
+        <w:tc>
+          <w:tcPr>
+            <w:tcW w:type="dxa" w:w="1728"/>
+          </w:tcPr>
+          <w:p>
+            <w:r>
+              <w:t>net_modularity</w:t>
+            </w:r>
+          </w:p>
+        </w:tc>
+        <w:tc>
+          <w:tcPr>
+            <w:tcW w:type="dxa" w:w="1728"/>
+          </w:tcPr>
+          <w:p>
+            <w:r>
+              <w:t>-0.001</w:t>
+            </w:r>
+          </w:p>
+        </w:tc>
+        <w:tc>
+          <w:tcPr>
+            <w:tcW w:type="dxa" w:w="1728"/>
+          </w:tcPr>
+          <w:p>
+            <w:r>
+              <w:t>0.89</w:t>
+            </w:r>
+          </w:p>
+        </w:tc>
+        <w:tc>
+          <w:tcPr>
+            <w:tcW w:type="dxa" w:w="1728"/>
+          </w:tcPr>
+          <w:p>
+            <w:r>
+              <w:t>0.022</w:t>
+            </w:r>
+          </w:p>
+        </w:tc>
+        <w:tc>
+          <w:tcPr>
+            <w:tcW w:type="dxa" w:w="1728"/>
+          </w:tcPr>
+          <w:p>
+            <w:r>
+              <w:t>-0.420</w:t>
+            </w:r>
+          </w:p>
+        </w:tc>
+      </w:tr>
+      <w:tr>
+        <w:tc>
+          <w:tcPr>
+            <w:tcW w:type="dxa" w:w="1728"/>
+          </w:tcPr>
+          <w:p>
+            <w:r>
+              <w:t>n</w:t>
+            </w:r>
+          </w:p>
+        </w:tc>
+        <w:tc>
+          <w:tcPr>
+            <w:tcW w:type="dxa" w:w="1728"/>
+          </w:tcPr>
+          <w:p>
+            <w:r>
+              <w:t>0.012</w:t>
+            </w:r>
+          </w:p>
+        </w:tc>
+        <w:tc>
+          <w:tcPr>
+            <w:tcW w:type="dxa" w:w="1728"/>
+          </w:tcPr>
+          <w:p>
+            <w:r>
+              <w:t>0.034</w:t>
+            </w:r>
+          </w:p>
+        </w:tc>
+        <w:tc>
+          <w:tcPr>
+            <w:tcW w:type="dxa" w:w="1728"/>
+          </w:tcPr>
+          <w:p>
+            <w:r>
+              <w:t>0.089</w:t>
+            </w:r>
+          </w:p>
+        </w:tc>
+        <w:tc>
+          <w:tcPr>
+            <w:tcW w:type="dxa" w:w="1728"/>
+          </w:tcPr>
+          <w:p>
+            <w:r>
+              <w:t>0.240</w:t>
+            </w:r>
+          </w:p>
+        </w:tc>
+      </w:tr>
+      <w:tr>
+        <w:tc>
+          <w:tcPr>
+            <w:tcW w:type="dxa" w:w="1728"/>
+          </w:tcPr>
+          <w:p>
+            <w:r>
+              <w:t>taxa</w:t>
+            </w:r>
+          </w:p>
+        </w:tc>
+        <w:tc>
+          <w:tcPr>
+            <w:tcW w:type="dxa" w:w="1728"/>
+          </w:tcPr>
+          <w:p>
+            <w:r>
+              <w:t>0.017</w:t>
+            </w:r>
+          </w:p>
+        </w:tc>
+        <w:tc>
+          <w:tcPr>
+            <w:tcW w:type="dxa" w:w="1728"/>
+          </w:tcPr>
+          <w:p>
+            <w:r>
+              <w:t>0.0061</w:t>
+            </w:r>
+          </w:p>
+        </w:tc>
+        <w:tc>
+          <w:tcPr>
+            <w:tcW w:type="dxa" w:w="1728"/>
+          </w:tcPr>
+          <w:p>
+            <w:r>
+              <w:t>0.127</w:t>
+            </w:r>
+          </w:p>
+        </w:tc>
+        <w:tc>
+          <w:tcPr>
+            <w:tcW w:type="dxa" w:w="1728"/>
+          </w:tcPr>
+          <w:p>
+            <w:r>
+              <w:t>0.540</w:t>
+            </w:r>
+          </w:p>
+        </w:tc>
+      </w:tr>
+      <w:tr>
+        <w:tc>
+          <w:tcPr>
+            <w:tcW w:type="dxa" w:w="1728"/>
+          </w:tcPr>
+          <w:p>
+            <w:r>
+              <w:t>assembly</w:t>
+            </w:r>
+          </w:p>
+        </w:tc>
+        <w:tc>
+          <w:tcPr>
+            <w:tcW w:type="dxa" w:w="1728"/>
+          </w:tcPr>
+          <w:p>
+            <w:r>
+              <w:t>-0.002</w:t>
+            </w:r>
+          </w:p>
+        </w:tc>
+        <w:tc>
+          <w:tcPr>
+            <w:tcW w:type="dxa" w:w="1728"/>
+          </w:tcPr>
+          <w:p>
+            <w:r>
+              <w:t>0.7</w:t>
+            </w:r>
+          </w:p>
+        </w:tc>
+        <w:tc>
+          <w:tcPr>
+            <w:tcW w:type="dxa" w:w="1728"/>
+          </w:tcPr>
+          <w:p>
+            <w:r>
+              <w:t>0.022</w:t>
+            </w:r>
+          </w:p>
+        </w:tc>
+        <w:tc>
+          <w:tcPr>
+            <w:tcW w:type="dxa" w:w="1728"/>
+          </w:tcPr>
+          <w:p>
+            <w:r>
+              <w:t>-0.550</w:t>
+            </w:r>
+          </w:p>
+        </w:tc>
+      </w:tr>
+      <w:tr>
+        <w:tc>
+          <w:tcPr>
+            <w:tcW w:type="dxa" w:w="1728"/>
+          </w:tcPr>
+          <w:p>
+            <w:r>
+              <w:t>human_gut</w:t>
+            </w:r>
+          </w:p>
+        </w:tc>
+        <w:tc>
+          <w:tcPr>
+            <w:tcW w:type="dxa" w:w="1728"/>
+          </w:tcPr>
+          <w:p>
+            <w:r>
+              <w:t>-0.007</w:t>
+            </w:r>
+          </w:p>
+        </w:tc>
+        <w:tc>
+          <w:tcPr>
+            <w:tcW w:type="dxa" w:w="1728"/>
+          </w:tcPr>
+          <w:p>
+            <w:r>
+              <w:t>0.24</w:t>
+            </w:r>
+          </w:p>
+        </w:tc>
+        <w:tc>
+          <w:tcPr>
+            <w:tcW w:type="dxa" w:w="1728"/>
+          </w:tcPr>
+          <w:p>
+            <w:r>
+              <w:t>0.001</w:t>
+            </w:r>
+          </w:p>
+        </w:tc>
+        <w:tc>
+          <w:tcPr>
+            <w:tcW w:type="dxa" w:w="1728"/>
+          </w:tcPr>
+          <w:p>
+            <w:r>
+              <w:t>-0.460</w:t>
+            </w:r>
+          </w:p>
+        </w:tc>
+      </w:tr>
+    </w:tbl>
+    <w:p>
+      <w:pPr>
+        <w:spacing w:after="120"/>
+        <w:jc w:val="both"/>
+      </w:pPr>
+      <w:r>
+        <w:t>Network density is the strongest independent predictor, followed by beta dispersion and community size. Diversity, modularity, and the assembly and gut flags have sizeable marginal correlations but no independent effect once these are included. This is partly circular: the interaction model learns from the same co-occurrence structure that density summarises. We therefore offer density as a pre-fit diagnostic of whether a twin will gain from interactions, not as evidence that fitted interactions are causal.</w:t>
+      </w:r>
+    </w:p>
+    <w:p>
+      <w:pPr>
         <w:pStyle w:val="Heading1"/>
       </w:pPr>
       <w:r>
@@ -4710,6 +5803,24 @@
     </w:p>
     <w:p>
       <w:pPr>
+        <w:spacing w:after="120"/>
+        <w:jc w:val="both"/>
+      </w:pPr>
+      <w:r>
+        <w:t>- Keystone consensus found only 2 of 248 genera at FDR &lt; 0.05, both oral; there is no cross-biome keystone signal.</w:t>
+      </w:r>
+    </w:p>
+    <w:p>
+      <w:pPr>
+        <w:spacing w:after="120"/>
+        <w:jc w:val="both"/>
+      </w:pPr>
+      <w:r>
+        <w:t>- Network modularity and Shannon diversity do not independently predict interaction gain.</w:t>
+      </w:r>
+    </w:p>
+    <w:p>
+      <w:pPr>
         <w:pStyle w:val="Heading1"/>
       </w:pPr>
       <w:r>
@@ -4766,7 +5877,7 @@
         <w:jc w:val="both"/>
       </w:pPr>
       <w:r>
-        <w:t>The program target of 40 external tools was not reached. Table 7 lists every tool actually used.</w:t>
+        <w:t>The program target of 40 external tools was not reached. The table lists every tool actually used, from results/tools_ledger.csv.</w:t>
       </w:r>
     </w:p>
     <w:p>
@@ -4774,7 +5885,7 @@
         <w:rPr>
           <w:b/>
         </w:rPr>
-        <w:t>Table 7. Tools table (honest count: 13).</w:t>
+        <w:t>Table 9. Tools ledger: 17 entries, 12 counting toward the gate after excluding infrastructure.</w:t>
       </w:r>
     </w:p>
     <w:tbl>
@@ -4784,13 +5895,15 @@
         <w:tblLook w:firstColumn="1" w:firstRow="1" w:lastColumn="0" w:lastRow="0" w:noHBand="0" w:noVBand="1" w:val="04A0"/>
       </w:tblPr>
       <w:tblGrid>
-        <w:gridCol w:w="4320"/>
-        <w:gridCol w:w="4320"/>
+        <w:gridCol w:w="2160"/>
+        <w:gridCol w:w="2160"/>
+        <w:gridCol w:w="2160"/>
+        <w:gridCol w:w="2160"/>
       </w:tblGrid>
       <w:tr>
         <w:tc>
           <w:tcPr>
-            <w:tcW w:type="dxa" w:w="4320"/>
+            <w:tcW w:type="dxa" w:w="2160"/>
           </w:tcPr>
           <w:p>
             <w:r>
@@ -4800,11 +5913,31 @@
         </w:tc>
         <w:tc>
           <w:tcPr>
-            <w:tcW w:type="dxa" w:w="4320"/>
-          </w:tcPr>
-          <w:p>
-            <w:r>
-              <w:t>role</w:t>
+            <w:tcW w:type="dxa" w:w="2160"/>
+          </w:tcPr>
+          <w:p>
+            <w:r>
+              <w:t>kind</w:t>
+            </w:r>
+          </w:p>
+        </w:tc>
+        <w:tc>
+          <w:tcPr>
+            <w:tcW w:type="dxa" w:w="2160"/>
+          </w:tcPr>
+          <w:p>
+            <w:r>
+              <w:t>where used</w:t>
+            </w:r>
+          </w:p>
+        </w:tc>
+        <w:tc>
+          <w:tcPr>
+            <w:tcW w:type="dxa" w:w="2160"/>
+          </w:tcPr>
+          <w:p>
+            <w:r>
+              <w:t>gate</w:t>
             </w:r>
           </w:p>
         </w:tc>
@@ -4812,21 +5945,41 @@
       <w:tr>
         <w:tc>
           <w:tcPr>
-            <w:tcW w:type="dxa" w:w="4320"/>
-          </w:tcPr>
-          <w:p>
-            <w:r>
-              <w:t>Python 3.10</w:t>
-            </w:r>
-          </w:p>
-        </w:tc>
-        <w:tc>
-          <w:tcPr>
-            <w:tcW w:type="dxa" w:w="4320"/>
-          </w:tcPr>
-          <w:p>
-            <w:r>
-              <w:t>language</w:t>
+            <w:tcW w:type="dxa" w:w="2160"/>
+          </w:tcPr>
+          <w:p>
+            <w:r>
+              <w:t>NumPy</w:t>
+            </w:r>
+          </w:p>
+        </w:tc>
+        <w:tc>
+          <w:tcPr>
+            <w:tcW w:type="dxa" w:w="2160"/>
+          </w:tcPr>
+          <w:p>
+            <w:r>
+              <w:t>library</w:t>
+            </w:r>
+          </w:p>
+        </w:tc>
+        <w:tc>
+          <w:tcPr>
+            <w:tcW w:type="dxa" w:w="2160"/>
+          </w:tcPr>
+          <w:p>
+            <w:r>
+              <w:t>src/microtwin; run_bench.py; scripts/</w:t>
+            </w:r>
+          </w:p>
+        </w:tc>
+        <w:tc>
+          <w:tcPr>
+            <w:tcW w:type="dxa" w:w="2160"/>
+          </w:tcPr>
+          <w:p>
+            <w:r>
+              <w:t>counts</w:t>
             </w:r>
           </w:p>
         </w:tc>
@@ -4834,21 +5987,41 @@
       <w:tr>
         <w:tc>
           <w:tcPr>
-            <w:tcW w:type="dxa" w:w="4320"/>
-          </w:tcPr>
-          <w:p>
-            <w:r>
-              <w:t>NumPy</w:t>
-            </w:r>
-          </w:p>
-        </w:tc>
-        <w:tc>
-          <w:tcPr>
-            <w:tcW w:type="dxa" w:w="4320"/>
-          </w:tcPr>
-          <w:p>
-            <w:r>
-              <w:t>arrays, bootstrap</w:t>
+            <w:tcW w:type="dxa" w:w="2160"/>
+          </w:tcPr>
+          <w:p>
+            <w:r>
+              <w:t>SciPy</w:t>
+            </w:r>
+          </w:p>
+        </w:tc>
+        <w:tc>
+          <w:tcPr>
+            <w:tcW w:type="dxa" w:w="2160"/>
+          </w:tcPr>
+          <w:p>
+            <w:r>
+              <w:t>library</w:t>
+            </w:r>
+          </w:p>
+        </w:tc>
+        <w:tc>
+          <w:tcPr>
+            <w:tcW w:type="dxa" w:w="2160"/>
+          </w:tcPr>
+          <w:p>
+            <w:r>
+              <w:t>src/microtwin/audit.py; scripts/ (stats; FDR inputs)</w:t>
+            </w:r>
+          </w:p>
+        </w:tc>
+        <w:tc>
+          <w:tcPr>
+            <w:tcW w:type="dxa" w:w="2160"/>
+          </w:tcPr>
+          <w:p>
+            <w:r>
+              <w:t>counts</w:t>
             </w:r>
           </w:p>
         </w:tc>
@@ -4856,21 +6029,41 @@
       <w:tr>
         <w:tc>
           <w:tcPr>
-            <w:tcW w:type="dxa" w:w="4320"/>
-          </w:tcPr>
-          <w:p>
-            <w:r>
-              <w:t>SciPy</w:t>
-            </w:r>
-          </w:p>
-        </w:tc>
-        <w:tc>
-          <w:tcPr>
-            <w:tcW w:type="dxa" w:w="4320"/>
-          </w:tcPr>
-          <w:p>
-            <w:r>
-              <w:t>Wilcoxon, ODE integration</w:t>
+            <w:tcW w:type="dxa" w:w="2160"/>
+          </w:tcPr>
+          <w:p>
+            <w:r>
+              <w:t>pandas</w:t>
+            </w:r>
+          </w:p>
+        </w:tc>
+        <w:tc>
+          <w:tcPr>
+            <w:tcW w:type="dxa" w:w="2160"/>
+          </w:tcPr>
+          <w:p>
+            <w:r>
+              <w:t>library</w:t>
+            </w:r>
+          </w:p>
+        </w:tc>
+        <w:tc>
+          <w:tcPr>
+            <w:tcW w:type="dxa" w:w="2160"/>
+          </w:tcPr>
+          <w:p>
+            <w:r>
+              <w:t>scripts/; paper/build_paper.py</w:t>
+            </w:r>
+          </w:p>
+        </w:tc>
+        <w:tc>
+          <w:tcPr>
+            <w:tcW w:type="dxa" w:w="2160"/>
+          </w:tcPr>
+          <w:p>
+            <w:r>
+              <w:t>counts</w:t>
             </w:r>
           </w:p>
         </w:tc>
@@ -4878,21 +6071,41 @@
       <w:tr>
         <w:tc>
           <w:tcPr>
-            <w:tcW w:type="dxa" w:w="4320"/>
-          </w:tcPr>
-          <w:p>
-            <w:r>
-              <w:t>pandas</w:t>
-            </w:r>
-          </w:p>
-        </w:tc>
-        <w:tc>
-          <w:tcPr>
-            <w:tcW w:type="dxa" w:w="4320"/>
-          </w:tcPr>
-          <w:p>
-            <w:r>
-              <w:t>data loading</w:t>
+            <w:tcW w:type="dxa" w:w="2160"/>
+          </w:tcPr>
+          <w:p>
+            <w:r>
+              <w:t>PyTorch</w:t>
+            </w:r>
+          </w:p>
+        </w:tc>
+        <w:tc>
+          <w:tcPr>
+            <w:tcW w:type="dxa" w:w="2160"/>
+          </w:tcPr>
+          <w:p>
+            <w:r>
+              <w:t>library</w:t>
+            </w:r>
+          </w:p>
+        </w:tc>
+        <w:tc>
+          <w:tcPr>
+            <w:tcW w:type="dxa" w:w="2160"/>
+          </w:tcPr>
+          <w:p>
+            <w:r>
+              <w:t>src/microtwin/models.py; run_bench.py (cNODE and graph-twin models)</w:t>
+            </w:r>
+          </w:p>
+        </w:tc>
+        <w:tc>
+          <w:tcPr>
+            <w:tcW w:type="dxa" w:w="2160"/>
+          </w:tcPr>
+          <w:p>
+            <w:r>
+              <w:t>counts</w:t>
             </w:r>
           </w:p>
         </w:tc>
@@ -4900,21 +6113,41 @@
       <w:tr>
         <w:tc>
           <w:tcPr>
-            <w:tcW w:type="dxa" w:w="4320"/>
-          </w:tcPr>
-          <w:p>
-            <w:r>
-              <w:t>PyTorch</w:t>
-            </w:r>
-          </w:p>
-        </w:tc>
-        <w:tc>
-          <w:tcPr>
-            <w:tcW w:type="dxa" w:w="4320"/>
-          </w:tcPr>
-          <w:p>
-            <w:r>
-              <w:t>cNODE, gLV, GraphTwin training</w:t>
+            <w:tcW w:type="dxa" w:w="2160"/>
+          </w:tcPr>
+          <w:p>
+            <w:r>
+              <w:t>Matplotlib</w:t>
+            </w:r>
+          </w:p>
+        </w:tc>
+        <w:tc>
+          <w:tcPr>
+            <w:tcW w:type="dxa" w:w="2160"/>
+          </w:tcPr>
+          <w:p>
+            <w:r>
+              <w:t>library</w:t>
+            </w:r>
+          </w:p>
+        </w:tc>
+        <w:tc>
+          <w:tcPr>
+            <w:tcW w:type="dxa" w:w="2160"/>
+          </w:tcPr>
+          <w:p>
+            <w:r>
+              <w:t>scripts/summarise_audit.py (fig_mgnify_audit.png)</w:t>
+            </w:r>
+          </w:p>
+        </w:tc>
+        <w:tc>
+          <w:tcPr>
+            <w:tcW w:type="dxa" w:w="2160"/>
+          </w:tcPr>
+          <w:p>
+            <w:r>
+              <w:t>counts</w:t>
             </w:r>
           </w:p>
         </w:tc>
@@ -4922,21 +6155,41 @@
       <w:tr>
         <w:tc>
           <w:tcPr>
-            <w:tcW w:type="dxa" w:w="4320"/>
-          </w:tcPr>
-          <w:p>
-            <w:r>
-              <w:t>matplotlib</w:t>
-            </w:r>
-          </w:p>
-        </w:tc>
-        <w:tc>
-          <w:tcPr>
-            <w:tcW w:type="dxa" w:w="4320"/>
-          </w:tcPr>
-          <w:p>
-            <w:r>
-              <w:t>figures</w:t>
+            <w:tcW w:type="dxa" w:w="2160"/>
+          </w:tcPr>
+          <w:p>
+            <w:r>
+              <w:t>python-docx</w:t>
+            </w:r>
+          </w:p>
+        </w:tc>
+        <w:tc>
+          <w:tcPr>
+            <w:tcW w:type="dxa" w:w="2160"/>
+          </w:tcPr>
+          <w:p>
+            <w:r>
+              <w:t>library</w:t>
+            </w:r>
+          </w:p>
+        </w:tc>
+        <w:tc>
+          <w:tcPr>
+            <w:tcW w:type="dxa" w:w="2160"/>
+          </w:tcPr>
+          <w:p>
+            <w:r>
+              <w:t>paper/paperkit.py</w:t>
+            </w:r>
+          </w:p>
+        </w:tc>
+        <w:tc>
+          <w:tcPr>
+            <w:tcW w:type="dxa" w:w="2160"/>
+          </w:tcPr>
+          <w:p>
+            <w:r>
+              <w:t>infra (excluded)</w:t>
             </w:r>
           </w:p>
         </w:tc>
@@ -4944,7 +6197,7 @@
       <w:tr>
         <w:tc>
           <w:tcPr>
-            <w:tcW w:type="dxa" w:w="4320"/>
+            <w:tcW w:type="dxa" w:w="2160"/>
           </w:tcPr>
           <w:p>
             <w:r>
@@ -4954,11 +6207,31 @@
         </w:tc>
         <w:tc>
           <w:tcPr>
-            <w:tcW w:type="dxa" w:w="4320"/>
-          </w:tcPr>
-          <w:p>
-            <w:r>
-              <w:t>hermetic tests</w:t>
+            <w:tcW w:type="dxa" w:w="2160"/>
+          </w:tcPr>
+          <w:p>
+            <w:r>
+              <w:t>test framework</w:t>
+            </w:r>
+          </w:p>
+        </w:tc>
+        <w:tc>
+          <w:tcPr>
+            <w:tcW w:type="dxa" w:w="2160"/>
+          </w:tcPr>
+          <w:p>
+            <w:r>
+              <w:t>tests/test_microtwin.py; tests/test_audit.py</w:t>
+            </w:r>
+          </w:p>
+        </w:tc>
+        <w:tc>
+          <w:tcPr>
+            <w:tcW w:type="dxa" w:w="2160"/>
+          </w:tcPr>
+          <w:p>
+            <w:r>
+              <w:t>infra (excluded)</w:t>
             </w:r>
           </w:p>
         </w:tc>
@@ -4966,21 +6239,41 @@
       <w:tr>
         <w:tc>
           <w:tcPr>
-            <w:tcW w:type="dxa" w:w="4320"/>
-          </w:tcPr>
-          <w:p>
-            <w:r>
-              <w:t>python-docx</w:t>
-            </w:r>
-          </w:p>
-        </w:tc>
-        <w:tc>
-          <w:tcPr>
-            <w:tcW w:type="dxa" w:w="4320"/>
-          </w:tcPr>
-          <w:p>
-            <w:r>
-              <w:t>this paper</w:t>
+            <w:tcW w:type="dxa" w:w="2160"/>
+          </w:tcPr>
+          <w:p>
+            <w:r>
+              <w:t>LibreOffice (soffice headless)</w:t>
+            </w:r>
+          </w:p>
+        </w:tc>
+        <w:tc>
+          <w:tcPr>
+            <w:tcW w:type="dxa" w:w="2160"/>
+          </w:tcPr>
+          <w:p>
+            <w:r>
+              <w:t>application</w:t>
+            </w:r>
+          </w:p>
+        </w:tc>
+        <w:tc>
+          <w:tcPr>
+            <w:tcW w:type="dxa" w:w="2160"/>
+          </w:tcPr>
+          <w:p>
+            <w:r>
+              <w:t>paper docx -&gt; pdf render</w:t>
+            </w:r>
+          </w:p>
+        </w:tc>
+        <w:tc>
+          <w:tcPr>
+            <w:tcW w:type="dxa" w:w="2160"/>
+          </w:tcPr>
+          <w:p>
+            <w:r>
+              <w:t>infra (excluded)</w:t>
             </w:r>
           </w:p>
         </w:tc>
@@ -4988,21 +6281,41 @@
       <w:tr>
         <w:tc>
           <w:tcPr>
-            <w:tcW w:type="dxa" w:w="4320"/>
-          </w:tcPr>
-          <w:p>
-            <w:r>
-              <w:t>cNODE repository (yixueyang/cNODE)</w:t>
-            </w:r>
-          </w:p>
-        </w:tc>
-        <w:tc>
-          <w:tcPr>
-            <w:tcW w:type="dxa" w:w="4320"/>
-          </w:tcPr>
-          <w:p>
-            <w:r>
-              <w:t>data and reference protocol</w:t>
+            <w:tcW w:type="dxa" w:w="2160"/>
+          </w:tcPr>
+          <w:p>
+            <w:r>
+              <w:t>poppler pdfinfo</w:t>
+            </w:r>
+          </w:p>
+        </w:tc>
+        <w:tc>
+          <w:tcPr>
+            <w:tcW w:type="dxa" w:w="2160"/>
+          </w:tcPr>
+          <w:p>
+            <w:r>
+              <w:t>application</w:t>
+            </w:r>
+          </w:p>
+        </w:tc>
+        <w:tc>
+          <w:tcPr>
+            <w:tcW w:type="dxa" w:w="2160"/>
+          </w:tcPr>
+          <w:p>
+            <w:r>
+              <w:t>page count of rendered paper</w:t>
+            </w:r>
+          </w:p>
+        </w:tc>
+        <w:tc>
+          <w:tcPr>
+            <w:tcW w:type="dxa" w:w="2160"/>
+          </w:tcPr>
+          <w:p>
+            <w:r>
+              <w:t>infra (excluded)</w:t>
             </w:r>
           </w:p>
         </w:tc>
@@ -5010,21 +6323,41 @@
       <w:tr>
         <w:tc>
           <w:tcPr>
-            <w:tcW w:type="dxa" w:w="4320"/>
-          </w:tcPr>
-          <w:p>
-            <w:r>
-              <w:t>MDSINE2_Paper repository (gerberlab)</w:t>
-            </w:r>
-          </w:p>
-        </w:tc>
-        <w:tc>
-          <w:tcPr>
-            <w:tcW w:type="dxa" w:w="4320"/>
-          </w:tcPr>
-          <w:p>
-            <w:r>
-              <w:t>data and official metric notebook</w:t>
+            <w:tcW w:type="dxa" w:w="2160"/>
+          </w:tcPr>
+          <w:p>
+            <w:r>
+              <w:t>Git + GitHub</w:t>
+            </w:r>
+          </w:p>
+        </w:tc>
+        <w:tc>
+          <w:tcPr>
+            <w:tcW w:type="dxa" w:w="2160"/>
+          </w:tcPr>
+          <w:p>
+            <w:r>
+              <w:t>service</w:t>
+            </w:r>
+          </w:p>
+        </w:tc>
+        <w:tc>
+          <w:tcPr>
+            <w:tcW w:type="dxa" w:w="2160"/>
+          </w:tcPr>
+          <w:p>
+            <w:r>
+              <w:t>repo hosting and pushes</w:t>
+            </w:r>
+          </w:p>
+        </w:tc>
+        <w:tc>
+          <w:tcPr>
+            <w:tcW w:type="dxa" w:w="2160"/>
+          </w:tcPr>
+          <w:p>
+            <w:r>
+              <w:t>infra (excluded)</w:t>
             </w:r>
           </w:p>
         </w:tc>
@@ -5032,21 +6365,41 @@
       <w:tr>
         <w:tc>
           <w:tcPr>
-            <w:tcW w:type="dxa" w:w="4320"/>
-          </w:tcPr>
-          <w:p>
-            <w:r>
-              <w:t>git / GitHub</w:t>
-            </w:r>
-          </w:p>
-        </w:tc>
-        <w:tc>
-          <w:tcPr>
-            <w:tcW w:type="dxa" w:w="4320"/>
-          </w:tcPr>
-          <w:p>
-            <w:r>
-              <w:t>version control</w:t>
+            <w:tcW w:type="dxa" w:w="2160"/>
+          </w:tcPr>
+          <w:p>
+            <w:r>
+              <w:t>EBI MGnify REST API v1</w:t>
+            </w:r>
+          </w:p>
+        </w:tc>
+        <w:tc>
+          <w:tcPr>
+            <w:tcW w:type="dxa" w:w="2160"/>
+          </w:tcPr>
+          <w:p>
+            <w:r>
+              <w:t>web API</w:t>
+            </w:r>
+          </w:p>
+        </w:tc>
+        <w:tc>
+          <w:tcPr>
+            <w:tcW w:type="dxa" w:w="2160"/>
+          </w:tcPr>
+          <w:p>
+            <w:r>
+              <w:t>scripts fetching data/raw/mgnify (manifest.csv); scripts/keystone_mgnify.py</w:t>
+            </w:r>
+          </w:p>
+        </w:tc>
+        <w:tc>
+          <w:tcPr>
+            <w:tcW w:type="dxa" w:w="2160"/>
+          </w:tcPr>
+          <w:p>
+            <w:r>
+              <w:t>counts</w:t>
             </w:r>
           </w:p>
         </w:tc>
@@ -5054,21 +6407,41 @@
       <w:tr>
         <w:tc>
           <w:tcPr>
-            <w:tcW w:type="dxa" w:w="4320"/>
-          </w:tcPr>
-          <w:p>
-            <w:r>
-              <w:t>MGnify REST API (EBI)</w:t>
-            </w:r>
-          </w:p>
-        </w:tc>
-        <w:tc>
-          <w:tcPr>
-            <w:tcW w:type="dxa" w:w="4320"/>
-          </w:tcPr>
-          <w:p>
-            <w:r>
-              <w:t>160 study taxonomy tables</w:t>
+            <w:tcW w:type="dxa" w:w="2160"/>
+          </w:tcPr>
+          <w:p>
+            <w:r>
+              <w:t>cNODE published benchmark data (Michel-Mata et al. 2022)</w:t>
+            </w:r>
+          </w:p>
+        </w:tc>
+        <w:tc>
+          <w:tcPr>
+            <w:tcW w:type="dxa" w:w="2160"/>
+          </w:tcPr>
+          <w:p>
+            <w:r>
+              <w:t>public data release</w:t>
+            </w:r>
+          </w:p>
+        </w:tc>
+        <w:tc>
+          <w:tcPr>
+            <w:tcW w:type="dxa" w:w="2160"/>
+          </w:tcPr>
+          <w:p>
+            <w:r>
+              <w:t>data/raw/cnode/*.csv; run_bench.py</w:t>
+            </w:r>
+          </w:p>
+        </w:tc>
+        <w:tc>
+          <w:tcPr>
+            <w:tcW w:type="dxa" w:w="2160"/>
+          </w:tcPr>
+          <w:p>
+            <w:r>
+              <w:t>counts</w:t>
             </w:r>
           </w:p>
         </w:tc>
@@ -5076,7 +6449,175 @@
       <w:tr>
         <w:tc>
           <w:tcPr>
-            <w:tcW w:type="dxa" w:w="4320"/>
+            <w:tcW w:type="dxa" w:w="2160"/>
+          </w:tcPr>
+          <w:p>
+            <w:r>
+              <w:t>MDSINE2 published data and Source Data (Gibson et al. 2025)</w:t>
+            </w:r>
+          </w:p>
+        </w:tc>
+        <w:tc>
+          <w:tcPr>
+            <w:tcW w:type="dxa" w:w="2160"/>
+          </w:tcPr>
+          <w:p>
+            <w:r>
+              <w:t>public data release</w:t>
+            </w:r>
+          </w:p>
+        </w:tc>
+        <w:tc>
+          <w:tcPr>
+            <w:tcW w:type="dxa" w:w="2160"/>
+          </w:tcPr>
+          <w:p>
+            <w:r>
+              <w:t>data/raw/mdsine2*; mdsine2 head-to-head results</w:t>
+            </w:r>
+          </w:p>
+        </w:tc>
+        <w:tc>
+          <w:tcPr>
+            <w:tcW w:type="dxa" w:w="2160"/>
+          </w:tcPr>
+          <w:p>
+            <w:r>
+              <w:t>counts</w:t>
+            </w:r>
+          </w:p>
+        </w:tc>
+      </w:tr>
+      <w:tr>
+        <w:tc>
+          <w:tcPr>
+            <w:tcW w:type="dxa" w:w="2160"/>
+          </w:tcPr>
+          <w:p>
+            <w:r>
+              <w:t>scikit-bio</w:t>
+            </w:r>
+          </w:p>
+        </w:tc>
+        <w:tc>
+          <w:tcPr>
+            <w:tcW w:type="dxa" w:w="2160"/>
+          </w:tcPr>
+          <w:p>
+            <w:r>
+              <w:t>library</w:t>
+            </w:r>
+          </w:p>
+        </w:tc>
+        <w:tc>
+          <w:tcPr>
+            <w:tcW w:type="dxa" w:w="2160"/>
+          </w:tcPr>
+          <w:p>
+            <w:r>
+              <w:t>scripts/predictors_audit.py (Shannon alpha, Bray-Curtis beta diversity)</w:t>
+            </w:r>
+          </w:p>
+        </w:tc>
+        <w:tc>
+          <w:tcPr>
+            <w:tcW w:type="dxa" w:w="2160"/>
+          </w:tcPr>
+          <w:p>
+            <w:r>
+              <w:t>counts</w:t>
+            </w:r>
+          </w:p>
+        </w:tc>
+      </w:tr>
+      <w:tr>
+        <w:tc>
+          <w:tcPr>
+            <w:tcW w:type="dxa" w:w="2160"/>
+          </w:tcPr>
+          <w:p>
+            <w:r>
+              <w:t>scikit-learn</w:t>
+            </w:r>
+          </w:p>
+        </w:tc>
+        <w:tc>
+          <w:tcPr>
+            <w:tcW w:type="dxa" w:w="2160"/>
+          </w:tcPr>
+          <w:p>
+            <w:r>
+              <w:t>library</w:t>
+            </w:r>
+          </w:p>
+        </w:tc>
+        <w:tc>
+          <w:tcPr>
+            <w:tcW w:type="dxa" w:w="2160"/>
+          </w:tcPr>
+          <w:p>
+            <w:r>
+              <w:t>scripts/predictors_audit.py (random forest, CV, permutation importance)</w:t>
+            </w:r>
+          </w:p>
+        </w:tc>
+        <w:tc>
+          <w:tcPr>
+            <w:tcW w:type="dxa" w:w="2160"/>
+          </w:tcPr>
+          <w:p>
+            <w:r>
+              <w:t>counts</w:t>
+            </w:r>
+          </w:p>
+        </w:tc>
+      </w:tr>
+      <w:tr>
+        <w:tc>
+          <w:tcPr>
+            <w:tcW w:type="dxa" w:w="2160"/>
+          </w:tcPr>
+          <w:p>
+            <w:r>
+              <w:t>networkx</w:t>
+            </w:r>
+          </w:p>
+        </w:tc>
+        <w:tc>
+          <w:tcPr>
+            <w:tcW w:type="dxa" w:w="2160"/>
+          </w:tcPr>
+          <w:p>
+            <w:r>
+              <w:t>library</w:t>
+            </w:r>
+          </w:p>
+        </w:tc>
+        <w:tc>
+          <w:tcPr>
+            <w:tcW w:type="dxa" w:w="2160"/>
+          </w:tcPr>
+          <w:p>
+            <w:r>
+              <w:t>scripts/predictors_audit.py (co-occurrence network density, modularity)</w:t>
+            </w:r>
+          </w:p>
+        </w:tc>
+        <w:tc>
+          <w:tcPr>
+            <w:tcW w:type="dxa" w:w="2160"/>
+          </w:tcPr>
+          <w:p>
+            <w:r>
+              <w:t>counts</w:t>
+            </w:r>
+          </w:p>
+        </w:tc>
+      </w:tr>
+      <w:tr>
+        <w:tc>
+          <w:tcPr>
+            <w:tcW w:type="dxa" w:w="2160"/>
           </w:tcPr>
           <w:p>
             <w:r>
@@ -5086,11 +6627,31 @@
         </w:tc>
         <w:tc>
           <w:tcPr>
-            <w:tcW w:type="dxa" w:w="4320"/>
-          </w:tcPr>
-          <w:p>
-            <w:r>
-              <w:t>confounder regression</w:t>
+            <w:tcW w:type="dxa" w:w="2160"/>
+          </w:tcPr>
+          <w:p>
+            <w:r>
+              <w:t>library</w:t>
+            </w:r>
+          </w:p>
+        </w:tc>
+        <w:tc>
+          <w:tcPr>
+            <w:tcW w:type="dxa" w:w="2160"/>
+          </w:tcPr>
+          <w:p>
+            <w:r>
+              <w:t>scripts/predictors_audit.py (OLS with HC3 robust SEs)</w:t>
+            </w:r>
+          </w:p>
+        </w:tc>
+        <w:tc>
+          <w:tcPr>
+            <w:tcW w:type="dxa" w:w="2160"/>
+          </w:tcPr>
+          <w:p>
+            <w:r>
+              <w:t>counts</w:t>
             </w:r>
           </w:p>
         </w:tc>
@@ -5126,7 +6687,7 @@
         <w:rPr>
           <w:b/>
         </w:rPr>
-        <w:t>Table 8. All 160 MGnify studies fetched and used (data/raw/mgnify/manifest.csv).</w:t>
+        <w:t>Table 10. All 160 MGnify studies fetched and used (data/raw/mgnify/manifest.csv).</w:t>
       </w:r>
     </w:p>
     <w:tbl>

</xml_diff>

<commit_message>
Paper v4: NCBI Taxonomy phylum enrichment + BugSigDB NB cross-check (negative) in 5.4; pdfinfo 24 pages
</commit_message>
<xml_diff>
--- a/paper/mega27-04-microbiome-twin-paper.docx
+++ b/paper/mega27-04-microbiome-twin-paper.docx
@@ -5200,6 +5200,40 @@
     </w:p>
     <w:p>
       <w:pPr>
+        <w:spacing w:after="120"/>
+        <w:jc w:val="both"/>
+      </w:pPr>
+      <w:r>
+        <w:t>Phylogeny. Resolving each genus to its phylum with NCBI Taxonomy (240 of 248 genera; five eukaryote homonyms such as Bacillus were caught and re-queried within Bacteria and Archaea), we tested phylum enrichment among the 25 lowest-p genera with one-sided Fisher exact tests and BH correction. Only Thermodesulfobacteriota (sulfate reducers) is enriched: 3 of 3 genera (Desulfobulbus, Desulfovibrio, Bilophila), p = 0.001, q = 0.019. With three genera, this is a hypothesis (hydrogen and sulfur cross-feeding hubs), not a result.</w:t>
+      </w:r>
+    </w:p>
+    <w:p>
+      <w:pPr>
+        <w:spacing w:after="120"/>
+        <w:jc w:val="both"/>
+      </w:pPr>
+      <w:r>
+        <w:t>Literature cross-check. Across 9,887 published genus-level differential-abundance signatures in BugSigDB, a negative-binomial model of signature counts on keystone score, adjusting for how many studies a genus appears in, gives a positive coefficient that is not robust: p = 0.025 with dispersion fixed at 1 and p = 0.062 with dispersion estimated (alpha = 1.16). Keystone-consensus genera are not clearly over-represented in the disease literature.</w:t>
+      </w:r>
+    </w:p>
+    <w:p>
+      <w:pPr>
+        <w:jc w:val="center"/>
+      </w:pPr>
+      <w:r>
+        <w:rPr>
+          <w:i/>
+        </w:rPr>
+        <w:t>log E[n_j] = c_0 + c_1 (-log10 p_j) + c_2 log(studies_j),   Var(n_j) = mu_j + alpha mu_j^2</w:t>
+      </w:r>
+      <w:r>
+        <w:tab/>
+        <w:tab/>
+        <w:t>(16)</w:t>
+      </w:r>
+    </w:p>
+    <w:p>
+      <w:pPr>
         <w:pStyle w:val="Heading2"/>
       </w:pPr>
       <w:r>
@@ -5228,7 +5262,7 @@
       <w:r>
         <w:tab/>
         <w:tab/>
-        <w:t>(16)</w:t>
+        <w:t>(17)</w:t>
       </w:r>
     </w:p>
     <w:p>
@@ -5821,6 +5855,15 @@
     </w:p>
     <w:p>
       <w:pPr>
+        <w:spacing w:after="120"/>
+        <w:jc w:val="both"/>
+      </w:pPr>
+      <w:r>
+        <w:t>- Keystone genera are not robustly over-represented in BugSigDB disease signatures (p = 0.062 with estimated dispersion).</w:t>
+      </w:r>
+    </w:p>
+    <w:p>
+      <w:pPr>
         <w:pStyle w:val="Heading1"/>
       </w:pPr>
       <w:r>
@@ -5885,7 +5928,7 @@
         <w:rPr>
           <w:b/>
         </w:rPr>
-        <w:t>Table 9. Tools ledger: 17 entries, 12 counting toward the gate after excluding infrastructure.</w:t>
+        <w:t>Table 9. Tools ledger: 19 entries, 14 counting toward the gate after excluding infrastructure.</w:t>
       </w:r>
     </w:p>
     <w:tbl>
@@ -6642,6 +6685,90 @@
           <w:p>
             <w:r>
               <w:t>scripts/predictors_audit.py (OLS with HC3 robust SEs)</w:t>
+            </w:r>
+          </w:p>
+        </w:tc>
+        <w:tc>
+          <w:tcPr>
+            <w:tcW w:type="dxa" w:w="2160"/>
+          </w:tcPr>
+          <w:p>
+            <w:r>
+              <w:t>counts</w:t>
+            </w:r>
+          </w:p>
+        </w:tc>
+      </w:tr>
+      <w:tr>
+        <w:tc>
+          <w:tcPr>
+            <w:tcW w:type="dxa" w:w="2160"/>
+          </w:tcPr>
+          <w:p>
+            <w:r>
+              <w:t>NCBI Taxonomy (E-utilities esearch/efetch)</w:t>
+            </w:r>
+          </w:p>
+        </w:tc>
+        <w:tc>
+          <w:tcPr>
+            <w:tcW w:type="dxa" w:w="2160"/>
+          </w:tcPr>
+          <w:p>
+            <w:r>
+              <w:t>database/web API</w:t>
+            </w:r>
+          </w:p>
+        </w:tc>
+        <w:tc>
+          <w:tcPr>
+            <w:tcW w:type="dxa" w:w="2160"/>
+          </w:tcPr>
+          <w:p>
+            <w:r>
+              <w:t>scripts/keystone_taxonomy.py (genus -&gt; phylum lineage)</w:t>
+            </w:r>
+          </w:p>
+        </w:tc>
+        <w:tc>
+          <w:tcPr>
+            <w:tcW w:type="dxa" w:w="2160"/>
+          </w:tcPr>
+          <w:p>
+            <w:r>
+              <w:t>counts</w:t>
+            </w:r>
+          </w:p>
+        </w:tc>
+      </w:tr>
+      <w:tr>
+        <w:tc>
+          <w:tcPr>
+            <w:tcW w:type="dxa" w:w="2160"/>
+          </w:tcPr>
+          <w:p>
+            <w:r>
+              <w:t>BugSigDB (genus signature export)</w:t>
+            </w:r>
+          </w:p>
+        </w:tc>
+        <w:tc>
+          <w:tcPr>
+            <w:tcW w:type="dxa" w:w="2160"/>
+          </w:tcPr>
+          <w:p>
+            <w:r>
+              <w:t>database</w:t>
+            </w:r>
+          </w:p>
+        </w:tc>
+        <w:tc>
+          <w:tcPr>
+            <w:tcW w:type="dxa" w:w="2160"/>
+          </w:tcPr>
+          <w:p>
+            <w:r>
+              <w:t>data/ref/bugsigdb_signatures_genus_taxname.gmt; scripts/keystone_bugsigdb.py (literature cross-check)</w:t>
             </w:r>
           </w:p>
         </w:tc>

</xml_diff>

<commit_message>
Paper v5: GTDB replication, anaerobe-keystone candidate (traits, within-study, abundance FE), new negatives; pdfinfo 26 pages
</commit_message>
<xml_diff>
--- a/paper/mega27-04-microbiome-twin-paper.docx
+++ b/paper/mega27-04-microbiome-twin-paper.docx
@@ -52,6 +52,15 @@
       </w:pPr>
       <w:r>
         <w:t>(4) Under a stricter metric that scores every timepoint, the same forecaster ranks first on both MDSINE2 cohorts (UC 1.654 vs MDSINE2 without modules 1.824; healthy 1.752 vs 2.072; p &lt; 1e-39), which falsified our own prediction that the advantage came from the detection-only metric. (5) At scale the picture changes: across 160 MGnify studies in 8 biomes, an interaction model beats a calibrated presence prior in 121 studies (FDR &lt; 0.05), so the human-data null of finding (1) does not generalise. We ship the microtwin command-line tool (audit and forecast) so anyone can run this audit on their own abundance table.</w:t>
+      </w:r>
+    </w:p>
+    <w:p>
+      <w:pPr>
+        <w:spacing w:after="120"/>
+        <w:jc w:val="both"/>
+      </w:pPr>
+      <w:r>
+        <w:t>(6) Exploratory keystone analysis names one candidate, the anaerobe-keystone hypothesis: across 156 studies, genera made of strict anaerobes are more often network hubs within the same study (study fixed-effect logit, p = 1.4e-4), independent of abundance and prevalence, and sulfate reducers are enriched under both NCBI and GTDB taxonomies (q = 0.02). No single biome passes FDR and keystones come from inferred networks, so this is a falsifiable candidate, not a discovery.</w:t>
       </w:r>
     </w:p>
     <w:p>
@@ -5234,6 +5243,1165 @@
     </w:p>
     <w:p>
       <w:pPr>
+        <w:spacing w:after="120"/>
+        <w:jc w:val="both"/>
+      </w:pPr>
+      <w:r>
+        <w:t>GTDB replication. Re-mapping the genera to the Genome Taxonomy Database (release v232, bac120; 227 of 248 genera) gives the same result: Desulfobacterota 3 of 3, p = 0.0012, q = 0.020. NCBI and GTDB disagree on the phylum of only 7 genera, mostly renamings. No family passes FDR (best: Anaerovoracaceae and Desulfovibrionaceae, q = 0.71). The result does not depend on the taxonomy, but it still rests on three genera.</w:t>
+      </w:r>
+    </w:p>
+    <w:p>
+      <w:pPr>
+        <w:pStyle w:val="Heading3"/>
+      </w:pPr>
+      <w:r>
+        <w:t>5.4.1 Physiological traits of keystones: the anaerobe-keystone candidate</w:t>
+      </w:r>
+    </w:p>
+    <w:p>
+      <w:pPr>
+        <w:spacing w:after="120"/>
+        <w:jc w:val="both"/>
+      </w:pPr>
+      <w:r>
+        <w:t>We joined each genus to the Madin et al. (2020) trait database (14,893 species; condensed_species_NCBI.csv), aggregating species to genus as the share of strict anaerobes, Gram-negative, motile and sporulating species, and the median genome size, GC content and doubling time. We test each trait against keystone frequency (Spearman, BH across traits) and top-25 membership (Mann-Whitney).</w:t>
+      </w:r>
+    </w:p>
+    <w:p>
+      <w:r>
+        <w:rPr>
+          <w:b/>
+        </w:rPr>
+        <w:t>Table 8. Keystone frequency vs genus traits (results/keystone_traits_tests.csv).</w:t>
+      </w:r>
+    </w:p>
+    <w:tbl>
+      <w:tblPr>
+        <w:tblStyle w:val="LightGrid-Accent1"/>
+        <w:tblW w:type="auto" w:w="0"/>
+        <w:tblLook w:firstColumn="1" w:firstRow="1" w:lastColumn="0" w:lastRow="0" w:noHBand="0" w:noVBand="1" w:val="04A0"/>
+      </w:tblPr>
+      <w:tblGrid>
+        <w:gridCol w:w="1234"/>
+        <w:gridCol w:w="1234"/>
+        <w:gridCol w:w="1234"/>
+        <w:gridCol w:w="1234"/>
+        <w:gridCol w:w="1234"/>
+        <w:gridCol w:w="1234"/>
+        <w:gridCol w:w="1234"/>
+      </w:tblGrid>
+      <w:tr>
+        <w:tc>
+          <w:tcPr>
+            <w:tcW w:type="dxa" w:w="1234"/>
+          </w:tcPr>
+          <w:p>
+            <w:r>
+              <w:t>trait</w:t>
+            </w:r>
+          </w:p>
+        </w:tc>
+        <w:tc>
+          <w:tcPr>
+            <w:tcW w:type="dxa" w:w="1234"/>
+          </w:tcPr>
+          <w:p>
+            <w:r>
+              <w:t>genera</w:t>
+            </w:r>
+          </w:p>
+        </w:tc>
+        <w:tc>
+          <w:tcPr>
+            <w:tcW w:type="dxa" w:w="1234"/>
+          </w:tcPr>
+          <w:p>
+            <w:r>
+              <w:t>Spearman rho</w:t>
+            </w:r>
+          </w:p>
+        </w:tc>
+        <w:tc>
+          <w:tcPr>
+            <w:tcW w:type="dxa" w:w="1234"/>
+          </w:tcPr>
+          <w:p>
+            <w:r>
+              <w:t>q (BH)</w:t>
+            </w:r>
+          </w:p>
+        </w:tc>
+        <w:tc>
+          <w:tcPr>
+            <w:tcW w:type="dxa" w:w="1234"/>
+          </w:tcPr>
+          <w:p>
+            <w:r>
+              <w:t>top-25 mean</w:t>
+            </w:r>
+          </w:p>
+        </w:tc>
+        <w:tc>
+          <w:tcPr>
+            <w:tcW w:type="dxa" w:w="1234"/>
+          </w:tcPr>
+          <w:p>
+            <w:r>
+              <w:t>rest mean</w:t>
+            </w:r>
+          </w:p>
+        </w:tc>
+        <w:tc>
+          <w:tcPr>
+            <w:tcW w:type="dxa" w:w="1234"/>
+          </w:tcPr>
+          <w:p>
+            <w:r>
+              <w:t>Mann-Whitney q</w:t>
+            </w:r>
+          </w:p>
+        </w:tc>
+      </w:tr>
+      <w:tr>
+        <w:tc>
+          <w:tcPr>
+            <w:tcW w:type="dxa" w:w="1234"/>
+          </w:tcPr>
+          <w:p>
+            <w:r>
+              <w:t>anaerobe</w:t>
+            </w:r>
+          </w:p>
+        </w:tc>
+        <w:tc>
+          <w:tcPr>
+            <w:tcW w:type="dxa" w:w="1234"/>
+          </w:tcPr>
+          <w:p>
+            <w:r>
+              <w:t>224</w:t>
+            </w:r>
+          </w:p>
+        </w:tc>
+        <w:tc>
+          <w:tcPr>
+            <w:tcW w:type="dxa" w:w="1234"/>
+          </w:tcPr>
+          <w:p>
+            <w:r>
+              <w:t>0.303</w:t>
+            </w:r>
+          </w:p>
+        </w:tc>
+        <w:tc>
+          <w:tcPr>
+            <w:tcW w:type="dxa" w:w="1234"/>
+          </w:tcPr>
+          <w:p>
+            <w:r>
+              <w:t>2.8e-05</w:t>
+            </w:r>
+          </w:p>
+        </w:tc>
+        <w:tc>
+          <w:tcPr>
+            <w:tcW w:type="dxa" w:w="1234"/>
+          </w:tcPr>
+          <w:p>
+            <w:r>
+              <w:t>0.703</w:t>
+            </w:r>
+          </w:p>
+        </w:tc>
+        <w:tc>
+          <w:tcPr>
+            <w:tcW w:type="dxa" w:w="1234"/>
+          </w:tcPr>
+          <w:p>
+            <w:r>
+              <w:t>0.411</w:t>
+            </w:r>
+          </w:p>
+        </w:tc>
+        <w:tc>
+          <w:tcPr>
+            <w:tcW w:type="dxa" w:w="1234"/>
+          </w:tcPr>
+          <w:p>
+            <w:r>
+              <w:t>0.08</w:t>
+            </w:r>
+          </w:p>
+        </w:tc>
+      </w:tr>
+      <w:tr>
+        <w:tc>
+          <w:tcPr>
+            <w:tcW w:type="dxa" w:w="1234"/>
+          </w:tcPr>
+          <w:p>
+            <w:r>
+              <w:t>gram_neg</w:t>
+            </w:r>
+          </w:p>
+        </w:tc>
+        <w:tc>
+          <w:tcPr>
+            <w:tcW w:type="dxa" w:w="1234"/>
+          </w:tcPr>
+          <w:p>
+            <w:r>
+              <w:t>225</w:t>
+            </w:r>
+          </w:p>
+        </w:tc>
+        <w:tc>
+          <w:tcPr>
+            <w:tcW w:type="dxa" w:w="1234"/>
+          </w:tcPr>
+          <w:p>
+            <w:r>
+              <w:t>-0.018</w:t>
+            </w:r>
+          </w:p>
+        </w:tc>
+        <w:tc>
+          <w:tcPr>
+            <w:tcW w:type="dxa" w:w="1234"/>
+          </w:tcPr>
+          <w:p>
+            <w:r>
+              <w:t>0.91</w:t>
+            </w:r>
+          </w:p>
+        </w:tc>
+        <w:tc>
+          <w:tcPr>
+            <w:tcW w:type="dxa" w:w="1234"/>
+          </w:tcPr>
+          <w:p>
+            <w:r>
+              <w:t>0.654</w:t>
+            </w:r>
+          </w:p>
+        </w:tc>
+        <w:tc>
+          <w:tcPr>
+            <w:tcW w:type="dxa" w:w="1234"/>
+          </w:tcPr>
+          <w:p>
+            <w:r>
+              <w:t>0.505</w:t>
+            </w:r>
+          </w:p>
+        </w:tc>
+        <w:tc>
+          <w:tcPr>
+            <w:tcW w:type="dxa" w:w="1234"/>
+          </w:tcPr>
+          <w:p>
+            <w:r>
+              <w:t>0.22</w:t>
+            </w:r>
+          </w:p>
+        </w:tc>
+      </w:tr>
+      <w:tr>
+        <w:tc>
+          <w:tcPr>
+            <w:tcW w:type="dxa" w:w="1234"/>
+          </w:tcPr>
+          <w:p>
+            <w:r>
+              <w:t>motile</w:t>
+            </w:r>
+          </w:p>
+        </w:tc>
+        <w:tc>
+          <w:tcPr>
+            <w:tcW w:type="dxa" w:w="1234"/>
+          </w:tcPr>
+          <w:p>
+            <w:r>
+              <w:t>200</w:t>
+            </w:r>
+          </w:p>
+        </w:tc>
+        <w:tc>
+          <w:tcPr>
+            <w:tcW w:type="dxa" w:w="1234"/>
+          </w:tcPr>
+          <w:p>
+            <w:r>
+              <w:t>-0.104</w:t>
+            </w:r>
+          </w:p>
+        </w:tc>
+        <w:tc>
+          <w:tcPr>
+            <w:tcW w:type="dxa" w:w="1234"/>
+          </w:tcPr>
+          <w:p>
+            <w:r>
+              <w:t>0.2</w:t>
+            </w:r>
+          </w:p>
+        </w:tc>
+        <w:tc>
+          <w:tcPr>
+            <w:tcW w:type="dxa" w:w="1234"/>
+          </w:tcPr>
+          <w:p>
+            <w:r>
+              <w:t>0.443</w:t>
+            </w:r>
+          </w:p>
+        </w:tc>
+        <w:tc>
+          <w:tcPr>
+            <w:tcW w:type="dxa" w:w="1234"/>
+          </w:tcPr>
+          <w:p>
+            <w:r>
+              <w:t>0.337</w:t>
+            </w:r>
+          </w:p>
+        </w:tc>
+        <w:tc>
+          <w:tcPr>
+            <w:tcW w:type="dxa" w:w="1234"/>
+          </w:tcPr>
+          <w:p>
+            <w:r>
+              <w:t>0.65</w:t>
+            </w:r>
+          </w:p>
+        </w:tc>
+      </w:tr>
+      <w:tr>
+        <w:tc>
+          <w:tcPr>
+            <w:tcW w:type="dxa" w:w="1234"/>
+          </w:tcPr>
+          <w:p>
+            <w:r>
+              <w:t>spore</w:t>
+            </w:r>
+          </w:p>
+        </w:tc>
+        <w:tc>
+          <w:tcPr>
+            <w:tcW w:type="dxa" w:w="1234"/>
+          </w:tcPr>
+          <w:p>
+            <w:r>
+              <w:t>214</w:t>
+            </w:r>
+          </w:p>
+        </w:tc>
+        <w:tc>
+          <w:tcPr>
+            <w:tcW w:type="dxa" w:w="1234"/>
+          </w:tcPr>
+          <w:p>
+            <w:r>
+              <w:t>-0.137</w:t>
+            </w:r>
+          </w:p>
+        </w:tc>
+        <w:tc>
+          <w:tcPr>
+            <w:tcW w:type="dxa" w:w="1234"/>
+          </w:tcPr>
+          <w:p>
+            <w:r>
+              <w:t>0.081</w:t>
+            </w:r>
+          </w:p>
+        </w:tc>
+        <w:tc>
+          <w:tcPr>
+            <w:tcW w:type="dxa" w:w="1234"/>
+          </w:tcPr>
+          <w:p>
+            <w:r>
+              <w:t>0.0455</w:t>
+            </w:r>
+          </w:p>
+        </w:tc>
+        <w:tc>
+          <w:tcPr>
+            <w:tcW w:type="dxa" w:w="1234"/>
+          </w:tcPr>
+          <w:p>
+            <w:r>
+              <w:t>0.144</w:t>
+            </w:r>
+          </w:p>
+        </w:tc>
+        <w:tc>
+          <w:tcPr>
+            <w:tcW w:type="dxa" w:w="1234"/>
+          </w:tcPr>
+          <w:p>
+            <w:r>
+              <w:t>0.22</w:t>
+            </w:r>
+          </w:p>
+        </w:tc>
+      </w:tr>
+      <w:tr>
+        <w:tc>
+          <w:tcPr>
+            <w:tcW w:type="dxa" w:w="1234"/>
+          </w:tcPr>
+          <w:p>
+            <w:r>
+              <w:t>genome_size</w:t>
+            </w:r>
+          </w:p>
+        </w:tc>
+        <w:tc>
+          <w:tcPr>
+            <w:tcW w:type="dxa" w:w="1234"/>
+          </w:tcPr>
+          <w:p>
+            <w:r>
+              <w:t>222</w:t>
+            </w:r>
+          </w:p>
+        </w:tc>
+        <w:tc>
+          <w:tcPr>
+            <w:tcW w:type="dxa" w:w="1234"/>
+          </w:tcPr>
+          <w:p>
+            <w:r>
+              <w:t>-0.246</w:t>
+            </w:r>
+          </w:p>
+        </w:tc>
+        <w:tc>
+          <w:tcPr>
+            <w:tcW w:type="dxa" w:w="1234"/>
+          </w:tcPr>
+          <w:p>
+            <w:r>
+              <w:t>0.00077</w:t>
+            </w:r>
+          </w:p>
+        </w:tc>
+        <w:tc>
+          <w:tcPr>
+            <w:tcW w:type="dxa" w:w="1234"/>
+          </w:tcPr>
+          <w:p>
+            <w:r>
+              <w:t>3.04e+06</w:t>
+            </w:r>
+          </w:p>
+        </w:tc>
+        <w:tc>
+          <w:tcPr>
+            <w:tcW w:type="dxa" w:w="1234"/>
+          </w:tcPr>
+          <w:p>
+            <w:r>
+              <w:t>3.64e+06</w:t>
+            </w:r>
+          </w:p>
+        </w:tc>
+        <w:tc>
+          <w:tcPr>
+            <w:tcW w:type="dxa" w:w="1234"/>
+          </w:tcPr>
+          <w:p>
+            <w:r>
+              <w:t>0.22</w:t>
+            </w:r>
+          </w:p>
+        </w:tc>
+      </w:tr>
+      <w:tr>
+        <w:tc>
+          <w:tcPr>
+            <w:tcW w:type="dxa" w:w="1234"/>
+          </w:tcPr>
+          <w:p>
+            <w:r>
+              <w:t>gc_content</w:t>
+            </w:r>
+          </w:p>
+        </w:tc>
+        <w:tc>
+          <w:tcPr>
+            <w:tcW w:type="dxa" w:w="1234"/>
+          </w:tcPr>
+          <w:p>
+            <w:r>
+              <w:t>192</w:t>
+            </w:r>
+          </w:p>
+        </w:tc>
+        <w:tc>
+          <w:tcPr>
+            <w:tcW w:type="dxa" w:w="1234"/>
+          </w:tcPr>
+          <w:p>
+            <w:r>
+              <w:t>-0.153</w:t>
+            </w:r>
+          </w:p>
+        </w:tc>
+        <w:tc>
+          <w:tcPr>
+            <w:tcW w:type="dxa" w:w="1234"/>
+          </w:tcPr>
+          <w:p>
+            <w:r>
+              <w:t>0.08</w:t>
+            </w:r>
+          </w:p>
+        </w:tc>
+        <w:tc>
+          <w:tcPr>
+            <w:tcW w:type="dxa" w:w="1234"/>
+          </w:tcPr>
+          <w:p>
+            <w:r>
+              <w:t>49</w:t>
+            </w:r>
+          </w:p>
+        </w:tc>
+        <w:tc>
+          <w:tcPr>
+            <w:tcW w:type="dxa" w:w="1234"/>
+          </w:tcPr>
+          <w:p>
+            <w:r>
+              <w:t>50.6</w:t>
+            </w:r>
+          </w:p>
+        </w:tc>
+        <w:tc>
+          <w:tcPr>
+            <w:tcW w:type="dxa" w:w="1234"/>
+          </w:tcPr>
+          <w:p>
+            <w:r>
+              <w:t>0.65</w:t>
+            </w:r>
+          </w:p>
+        </w:tc>
+      </w:tr>
+      <w:tr>
+        <w:tc>
+          <w:tcPr>
+            <w:tcW w:type="dxa" w:w="1234"/>
+          </w:tcPr>
+          <w:p>
+            <w:r>
+              <w:t>doubling_h</w:t>
+            </w:r>
+          </w:p>
+        </w:tc>
+        <w:tc>
+          <w:tcPr>
+            <w:tcW w:type="dxa" w:w="1234"/>
+          </w:tcPr>
+          <w:p>
+            <w:r>
+              <w:t>57</w:t>
+            </w:r>
+          </w:p>
+        </w:tc>
+        <w:tc>
+          <w:tcPr>
+            <w:tcW w:type="dxa" w:w="1234"/>
+          </w:tcPr>
+          <w:p>
+            <w:r>
+              <w:t>0.008</w:t>
+            </w:r>
+          </w:p>
+        </w:tc>
+        <w:tc>
+          <w:tcPr>
+            <w:tcW w:type="dxa" w:w="1234"/>
+          </w:tcPr>
+          <w:p>
+            <w:r>
+              <w:t>0.96</w:t>
+            </w:r>
+          </w:p>
+        </w:tc>
+        <w:tc>
+          <w:tcPr>
+            <w:tcW w:type="dxa" w:w="1234"/>
+          </w:tcPr>
+          <w:p>
+            <w:r>
+              <w:t>10.6</w:t>
+            </w:r>
+          </w:p>
+        </w:tc>
+        <w:tc>
+          <w:tcPr>
+            <w:tcW w:type="dxa" w:w="1234"/>
+          </w:tcPr>
+          <w:p>
+            <w:r>
+              <w:t>4.36</w:t>
+            </w:r>
+          </w:p>
+        </w:tc>
+        <w:tc>
+          <w:tcPr>
+            <w:tcW w:type="dxa" w:w="1234"/>
+          </w:tcPr>
+          <w:p>
+            <w:r>
+              <w:t>1</w:t>
+            </w:r>
+          </w:p>
+        </w:tc>
+      </w:tr>
+    </w:tbl>
+    <w:p>
+      <w:pPr>
+        <w:spacing w:after="120"/>
+        <w:jc w:val="both"/>
+      </w:pPr>
+      <w:r>
+        <w:t>Strict-anaerobe share and small genome size track keystone frequency; the other traits do not. The anaerobe effect keeps its sign and significance in a rank regression with genome size and log study count (p = 5.8e-04, HC3) and under permutation within study-count quintiles (p = 2.0e-04). Because biome could confound this (anaerobes dominate gut studies), we ran two falsification tests inside studies. First, within each of 155 studies we compared keystones with the other genera: keystones have the higher anaerobe share in 62% of studies (mean difference +0.071, sign-flip p = 2.0e-04). Second, we fitted a logistic model with study fixed effects and study-clustered standard errors, adding abundance and prevalence:</w:t>
+      </w:r>
+    </w:p>
+    <w:p>
+      <w:pPr>
+        <w:jc w:val="center"/>
+      </w:pPr>
+      <w:r>
+        <w:rPr>
+          <w:i/>
+        </w:rPr>
+        <w:t>logit P(top_js = 1) = a_s + b_1 anaerobe_j + b_2 log10(mean RA_js) + b_3 prevalence_js</w:t>
+      </w:r>
+      <w:r>
+        <w:tab/>
+        <w:tab/>
+        <w:t>(17)</w:t>
+      </w:r>
+    </w:p>
+    <w:p>
+      <w:pPr>
+        <w:spacing w:after="120"/>
+        <w:jc w:val="both"/>
+      </w:pPr>
+      <w:r>
+        <w:t>On 10,599 genus-study rows from 156 studies, b_1 = 0.40 (p = 1.4e-04), almost the same as without abundance terms (0.41). Anaerobe share is nearly uncorrelated with abundance (r = 0.09). So the association is not a biome mix or abundance artifact.</w:t>
+      </w:r>
+    </w:p>
+    <w:p>
+      <w:r>
+        <w:rPr>
+          <w:b/>
+        </w:rPr>
+        <w:t>Table 9. Within-study anaerobe difference by biome (results/keystone_traits_biome.json).</w:t>
+      </w:r>
+    </w:p>
+    <w:tbl>
+      <w:tblPr>
+        <w:tblStyle w:val="LightGrid-Accent1"/>
+        <w:tblW w:type="auto" w:w="0"/>
+        <w:tblLook w:firstColumn="1" w:firstRow="1" w:lastColumn="0" w:lastRow="0" w:noHBand="0" w:noVBand="1" w:val="04A0"/>
+      </w:tblPr>
+      <w:tblGrid>
+        <w:gridCol w:w="1728"/>
+        <w:gridCol w:w="1728"/>
+        <w:gridCol w:w="1728"/>
+        <w:gridCol w:w="1728"/>
+        <w:gridCol w:w="1728"/>
+      </w:tblGrid>
+      <w:tr>
+        <w:tc>
+          <w:tcPr>
+            <w:tcW w:type="dxa" w:w="1728"/>
+          </w:tcPr>
+          <w:p>
+            <w:r>
+              <w:t>biome</w:t>
+            </w:r>
+          </w:p>
+        </w:tc>
+        <w:tc>
+          <w:tcPr>
+            <w:tcW w:type="dxa" w:w="1728"/>
+          </w:tcPr>
+          <w:p>
+            <w:r>
+              <w:t>studies</w:t>
+            </w:r>
+          </w:p>
+        </w:tc>
+        <w:tc>
+          <w:tcPr>
+            <w:tcW w:type="dxa" w:w="1728"/>
+          </w:tcPr>
+          <w:p>
+            <w:r>
+              <w:t>mean difference (top - rest)</w:t>
+            </w:r>
+          </w:p>
+        </w:tc>
+        <w:tc>
+          <w:tcPr>
+            <w:tcW w:type="dxa" w:w="1728"/>
+          </w:tcPr>
+          <w:p>
+            <w:r>
+              <w:t>p (sign-flip)</w:t>
+            </w:r>
+          </w:p>
+        </w:tc>
+        <w:tc>
+          <w:tcPr>
+            <w:tcW w:type="dxa" w:w="1728"/>
+          </w:tcPr>
+          <w:p>
+            <w:r>
+              <w:t>q (BH)</w:t>
+            </w:r>
+          </w:p>
+        </w:tc>
+      </w:tr>
+      <w:tr>
+        <w:tc>
+          <w:tcPr>
+            <w:tcW w:type="dxa" w:w="1728"/>
+          </w:tcPr>
+          <w:p>
+            <w:r>
+              <w:t>Digestive system</w:t>
+            </w:r>
+          </w:p>
+        </w:tc>
+        <w:tc>
+          <w:tcPr>
+            <w:tcW w:type="dxa" w:w="1728"/>
+          </w:tcPr>
+          <w:p>
+            <w:r>
+              <w:t>41</w:t>
+            </w:r>
+          </w:p>
+        </w:tc>
+        <w:tc>
+          <w:tcPr>
+            <w:tcW w:type="dxa" w:w="1728"/>
+          </w:tcPr>
+          <w:p>
+            <w:r>
+              <w:t>+0.065</w:t>
+            </w:r>
+          </w:p>
+        </w:tc>
+        <w:tc>
+          <w:tcPr>
+            <w:tcW w:type="dxa" w:w="1728"/>
+          </w:tcPr>
+          <w:p>
+            <w:r>
+              <w:t>0.038</w:t>
+            </w:r>
+          </w:p>
+        </w:tc>
+        <w:tc>
+          <w:tcPr>
+            <w:tcW w:type="dxa" w:w="1728"/>
+          </w:tcPr>
+          <w:p>
+            <w:r>
+              <w:t>0.10</w:t>
+            </w:r>
+          </w:p>
+        </w:tc>
+      </w:tr>
+      <w:tr>
+        <w:tc>
+          <w:tcPr>
+            <w:tcW w:type="dxa" w:w="1728"/>
+          </w:tcPr>
+          <w:p>
+            <w:r>
+              <w:t>Oral</w:t>
+            </w:r>
+          </w:p>
+        </w:tc>
+        <w:tc>
+          <w:tcPr>
+            <w:tcW w:type="dxa" w:w="1728"/>
+          </w:tcPr>
+          <w:p>
+            <w:r>
+              <w:t>19</w:t>
+            </w:r>
+          </w:p>
+        </w:tc>
+        <w:tc>
+          <w:tcPr>
+            <w:tcW w:type="dxa" w:w="1728"/>
+          </w:tcPr>
+          <w:p>
+            <w:r>
+              <w:t>+0.014</w:t>
+            </w:r>
+          </w:p>
+        </w:tc>
+        <w:tc>
+          <w:tcPr>
+            <w:tcW w:type="dxa" w:w="1728"/>
+          </w:tcPr>
+          <w:p>
+            <w:r>
+              <w:t>0.720</w:t>
+            </w:r>
+          </w:p>
+        </w:tc>
+        <w:tc>
+          <w:tcPr>
+            <w:tcW w:type="dxa" w:w="1728"/>
+          </w:tcPr>
+          <w:p>
+            <w:r>
+              <w:t>0.72</w:t>
+            </w:r>
+          </w:p>
+        </w:tc>
+      </w:tr>
+      <w:tr>
+        <w:tc>
+          <w:tcPr>
+            <w:tcW w:type="dxa" w:w="1728"/>
+          </w:tcPr>
+          <w:p>
+            <w:r>
+              <w:t>Skin</w:t>
+            </w:r>
+          </w:p>
+        </w:tc>
+        <w:tc>
+          <w:tcPr>
+            <w:tcW w:type="dxa" w:w="1728"/>
+          </w:tcPr>
+          <w:p>
+            <w:r>
+              <w:t>17</w:t>
+            </w:r>
+          </w:p>
+        </w:tc>
+        <w:tc>
+          <w:tcPr>
+            <w:tcW w:type="dxa" w:w="1728"/>
+          </w:tcPr>
+          <w:p>
+            <w:r>
+              <w:t>+0.110</w:t>
+            </w:r>
+          </w:p>
+        </w:tc>
+        <w:tc>
+          <w:tcPr>
+            <w:tcW w:type="dxa" w:w="1728"/>
+          </w:tcPr>
+          <w:p>
+            <w:r>
+              <w:t>0.034</w:t>
+            </w:r>
+          </w:p>
+        </w:tc>
+        <w:tc>
+          <w:tcPr>
+            <w:tcW w:type="dxa" w:w="1728"/>
+          </w:tcPr>
+          <w:p>
+            <w:r>
+              <w:t>0.10</w:t>
+            </w:r>
+          </w:p>
+        </w:tc>
+      </w:tr>
+      <w:tr>
+        <w:tc>
+          <w:tcPr>
+            <w:tcW w:type="dxa" w:w="1728"/>
+          </w:tcPr>
+          <w:p>
+            <w:r>
+              <w:t>Mammals</w:t>
+            </w:r>
+          </w:p>
+        </w:tc>
+        <w:tc>
+          <w:tcPr>
+            <w:tcW w:type="dxa" w:w="1728"/>
+          </w:tcPr>
+          <w:p>
+            <w:r>
+              <w:t>20</w:t>
+            </w:r>
+          </w:p>
+        </w:tc>
+        <w:tc>
+          <w:tcPr>
+            <w:tcW w:type="dxa" w:w="1728"/>
+          </w:tcPr>
+          <w:p>
+            <w:r>
+              <w:t>+0.056</w:t>
+            </w:r>
+          </w:p>
+        </w:tc>
+        <w:tc>
+          <w:tcPr>
+            <w:tcW w:type="dxa" w:w="1728"/>
+          </w:tcPr>
+          <w:p>
+            <w:r>
+              <w:t>0.174</w:t>
+            </w:r>
+          </w:p>
+        </w:tc>
+        <w:tc>
+          <w:tcPr>
+            <w:tcW w:type="dxa" w:w="1728"/>
+          </w:tcPr>
+          <w:p>
+            <w:r>
+              <w:t>0.28</w:t>
+            </w:r>
+          </w:p>
+        </w:tc>
+      </w:tr>
+      <w:tr>
+        <w:tc>
+          <w:tcPr>
+            <w:tcW w:type="dxa" w:w="1728"/>
+          </w:tcPr>
+          <w:p>
+            <w:r>
+              <w:t>Plants</w:t>
+            </w:r>
+          </w:p>
+        </w:tc>
+        <w:tc>
+          <w:tcPr>
+            <w:tcW w:type="dxa" w:w="1728"/>
+          </w:tcPr>
+          <w:p>
+            <w:r>
+              <w:t>18</w:t>
+            </w:r>
+          </w:p>
+        </w:tc>
+        <w:tc>
+          <w:tcPr>
+            <w:tcW w:type="dxa" w:w="1728"/>
+          </w:tcPr>
+          <w:p>
+            <w:r>
+              <w:t>+0.041</w:t>
+            </w:r>
+          </w:p>
+        </w:tc>
+        <w:tc>
+          <w:tcPr>
+            <w:tcW w:type="dxa" w:w="1728"/>
+          </w:tcPr>
+          <w:p>
+            <w:r>
+              <w:t>0.605</w:t>
+            </w:r>
+          </w:p>
+        </w:tc>
+        <w:tc>
+          <w:tcPr>
+            <w:tcW w:type="dxa" w:w="1728"/>
+          </w:tcPr>
+          <w:p>
+            <w:r>
+              <w:t>0.69</w:t>
+            </w:r>
+          </w:p>
+        </w:tc>
+      </w:tr>
+      <w:tr>
+        <w:tc>
+          <w:tcPr>
+            <w:tcW w:type="dxa" w:w="1728"/>
+          </w:tcPr>
+          <w:p>
+            <w:r>
+              <w:t>Birds</w:t>
+            </w:r>
+          </w:p>
+        </w:tc>
+        <w:tc>
+          <w:tcPr>
+            <w:tcW w:type="dxa" w:w="1728"/>
+          </w:tcPr>
+          <w:p>
+            <w:r>
+              <w:t>19</w:t>
+            </w:r>
+          </w:p>
+        </w:tc>
+        <w:tc>
+          <w:tcPr>
+            <w:tcW w:type="dxa" w:w="1728"/>
+          </w:tcPr>
+          <w:p>
+            <w:r>
+              <w:t>+0.178</w:t>
+            </w:r>
+          </w:p>
+        </w:tc>
+        <w:tc>
+          <w:tcPr>
+            <w:tcW w:type="dxa" w:w="1728"/>
+          </w:tcPr>
+          <w:p>
+            <w:r>
+              <w:t>0.020</w:t>
+            </w:r>
+          </w:p>
+        </w:tc>
+        <w:tc>
+          <w:tcPr>
+            <w:tcW w:type="dxa" w:w="1728"/>
+          </w:tcPr>
+          <w:p>
+            <w:r>
+              <w:t>0.10</w:t>
+            </w:r>
+          </w:p>
+        </w:tc>
+      </w:tr>
+      <w:tr>
+        <w:tc>
+          <w:tcPr>
+            <w:tcW w:type="dxa" w:w="1728"/>
+          </w:tcPr>
+          <w:p>
+            <w:r>
+              <w:t>Fish</w:t>
+            </w:r>
+          </w:p>
+        </w:tc>
+        <w:tc>
+          <w:tcPr>
+            <w:tcW w:type="dxa" w:w="1728"/>
+          </w:tcPr>
+          <w:p>
+            <w:r>
+              <w:t>14</w:t>
+            </w:r>
+          </w:p>
+        </w:tc>
+        <w:tc>
+          <w:tcPr>
+            <w:tcW w:type="dxa" w:w="1728"/>
+          </w:tcPr>
+          <w:p>
+            <w:r>
+              <w:t>+0.081</w:t>
+            </w:r>
+          </w:p>
+        </w:tc>
+        <w:tc>
+          <w:tcPr>
+            <w:tcW w:type="dxa" w:w="1728"/>
+          </w:tcPr>
+          <w:p>
+            <w:r>
+              <w:t>0.134</w:t>
+            </w:r>
+          </w:p>
+        </w:tc>
+        <w:tc>
+          <w:tcPr>
+            <w:tcW w:type="dxa" w:w="1728"/>
+          </w:tcPr>
+          <w:p>
+            <w:r>
+              <w:t>0.27</w:t>
+            </w:r>
+          </w:p>
+        </w:tc>
+      </w:tr>
+      <w:tr>
+        <w:tc>
+          <w:tcPr>
+            <w:tcW w:type="dxa" w:w="1728"/>
+          </w:tcPr>
+          <w:p>
+            <w:r>
+              <w:t>Insecta</w:t>
+            </w:r>
+          </w:p>
+        </w:tc>
+        <w:tc>
+          <w:tcPr>
+            <w:tcW w:type="dxa" w:w="1728"/>
+          </w:tcPr>
+          <w:p>
+            <w:r>
+              <w:t>7</w:t>
+            </w:r>
+          </w:p>
+        </w:tc>
+        <w:tc>
+          <w:tcPr>
+            <w:tcW w:type="dxa" w:w="1728"/>
+          </w:tcPr>
+          <w:p>
+            <w:r>
+              <w:t>-0.026</w:t>
+            </w:r>
+          </w:p>
+        </w:tc>
+        <w:tc>
+          <w:tcPr>
+            <w:tcW w:type="dxa" w:w="1728"/>
+          </w:tcPr>
+          <w:p>
+            <w:r>
+              <w:t>0.602</w:t>
+            </w:r>
+          </w:p>
+        </w:tc>
+        <w:tc>
+          <w:tcPr>
+            <w:tcW w:type="dxa" w:w="1728"/>
+          </w:tcPr>
+          <w:p>
+            <w:r>
+              <w:t>0.69</w:t>
+            </w:r>
+          </w:p>
+        </w:tc>
+      </w:tr>
+    </w:tbl>
+    <w:p>
+      <w:pPr>
+        <w:spacing w:after="120"/>
+        <w:jc w:val="both"/>
+      </w:pPr>
+      <w:r>
+        <w:t>It is positive in 7 of 8 biomes but no single biome passes FDR (smallest q = 0.10). We name it the anaerobe-keystone hypothesis: genera made of strict anaerobes rank as network hubs more often, independent of biome, abundance and prevalence. It is falsified if (a) it fails in an independent cohort with a single biome and adequate power, or (b) perturbation experiments show inferred out-strength does not predict community response. Keystone status here comes from our own inferred networks, so this is a candidate property of interaction inference, not a proven ecological law.</w:t>
+      </w:r>
+    </w:p>
+    <w:p>
+      <w:pPr>
         <w:pStyle w:val="Heading2"/>
       </w:pPr>
       <w:r>
@@ -5262,7 +6430,7 @@
       <w:r>
         <w:tab/>
         <w:tab/>
-        <w:t>(17)</w:t>
+        <w:t>(18)</w:t>
       </w:r>
     </w:p>
     <w:p>
@@ -5270,7 +6438,7 @@
         <w:rPr>
           <w:b/>
         </w:rPr>
-        <w:t>Table 8. Predictors of interaction gain (OLS R^2 = 0.47; random forest 5-fold CV R^2 = 0.37; results/predictors_audit.json).</w:t>
+        <w:t>Table 10. Predictors of interaction gain (OLS R^2 = 0.47; random forest 5-fold CV R^2 = 0.37; results/predictors_audit.json).</w:t>
       </w:r>
     </w:p>
     <w:tbl>
@@ -5864,6 +7032,33 @@
     </w:p>
     <w:p>
       <w:pPr>
+        <w:spacing w:after="120"/>
+        <w:jc w:val="both"/>
+      </w:pPr>
+      <w:r>
+        <w:t>- No GTDB family is enriched among keystones after FDR (best q = 0.71).</w:t>
+      </w:r>
+    </w:p>
+    <w:p>
+      <w:pPr>
+        <w:spacing w:after="120"/>
+        <w:jc w:val="both"/>
+      </w:pPr>
+      <w:r>
+        <w:t>- Gram stain, motility, sporulation, GC content and doubling time do not track keystone frequency after BH.</w:t>
+      </w:r>
+    </w:p>
+    <w:p>
+      <w:pPr>
+        <w:spacing w:after="120"/>
+        <w:jc w:val="both"/>
+      </w:pPr>
+      <w:r>
+        <w:t>- The anaerobe-keystone association does not pass FDR within any single biome (Oral, Plants, Insecta show near-zero or negative effects).</w:t>
+      </w:r>
+    </w:p>
+    <w:p>
+      <w:pPr>
         <w:pStyle w:val="Heading1"/>
       </w:pPr>
       <w:r>
@@ -5928,7 +7123,7 @@
         <w:rPr>
           <w:b/>
         </w:rPr>
-        <w:t>Table 9. Tools ledger: 19 entries, 14 counting toward the gate after excluding infrastructure.</w:t>
+        <w:t>Table 11. Tools ledger: 21 entries, 16 counting toward the gate after excluding infrastructure.</w:t>
       </w:r>
     </w:p>
     <w:tbl>
@@ -6769,6 +7964,90 @@
           <w:p>
             <w:r>
               <w:t>data/ref/bugsigdb_signatures_genus_taxname.gmt; scripts/keystone_bugsigdb.py (literature cross-check)</w:t>
+            </w:r>
+          </w:p>
+        </w:tc>
+        <w:tc>
+          <w:tcPr>
+            <w:tcW w:type="dxa" w:w="2160"/>
+          </w:tcPr>
+          <w:p>
+            <w:r>
+              <w:t>counts</w:t>
+            </w:r>
+          </w:p>
+        </w:tc>
+      </w:tr>
+      <w:tr>
+        <w:tc>
+          <w:tcPr>
+            <w:tcW w:type="dxa" w:w="2160"/>
+          </w:tcPr>
+          <w:p>
+            <w:r>
+              <w:t>GTDB (release v232 bac120 taxonomy)</w:t>
+            </w:r>
+          </w:p>
+        </w:tc>
+        <w:tc>
+          <w:tcPr>
+            <w:tcW w:type="dxa" w:w="2160"/>
+          </w:tcPr>
+          <w:p>
+            <w:r>
+              <w:t>database</w:t>
+            </w:r>
+          </w:p>
+        </w:tc>
+        <w:tc>
+          <w:tcPr>
+            <w:tcW w:type="dxa" w:w="2160"/>
+          </w:tcPr>
+          <w:p>
+            <w:r>
+              <w:t>scripts/keystone_gtdb.py</w:t>
+            </w:r>
+          </w:p>
+        </w:tc>
+        <w:tc>
+          <w:tcPr>
+            <w:tcW w:type="dxa" w:w="2160"/>
+          </w:tcPr>
+          <w:p>
+            <w:r>
+              <w:t>counts</w:t>
+            </w:r>
+          </w:p>
+        </w:tc>
+      </w:tr>
+      <w:tr>
+        <w:tc>
+          <w:tcPr>
+            <w:tcW w:type="dxa" w:w="2160"/>
+          </w:tcPr>
+          <w:p>
+            <w:r>
+              <w:t>Madin et al. 2020 bacterial/archaeal trait database (condensed_species_NCBI)</w:t>
+            </w:r>
+          </w:p>
+        </w:tc>
+        <w:tc>
+          <w:tcPr>
+            <w:tcW w:type="dxa" w:w="2160"/>
+          </w:tcPr>
+          <w:p>
+            <w:r>
+              <w:t>database</w:t>
+            </w:r>
+          </w:p>
+        </w:tc>
+        <w:tc>
+          <w:tcPr>
+            <w:tcW w:type="dxa" w:w="2160"/>
+          </w:tcPr>
+          <w:p>
+            <w:r>
+              <w:t>scripts/keystone_traits.py</w:t>
             </w:r>
           </w:p>
         </w:tc>
@@ -6814,7 +8093,7 @@
         <w:rPr>
           <w:b/>
         </w:rPr>
-        <w:t>Table 10. All 160 MGnify studies fetched and used (data/raw/mgnify/manifest.csv).</w:t>
+        <w:t>Table 12. All 160 MGnify studies fetched and used (data/raw/mgnify/manifest.csv).</w:t>
       </w:r>
     </w:p>
     <w:tbl>
@@ -15236,6 +16515,24 @@
       </w:pPr>
       <w:r>
         <w:t>Gibson TE, Kim Y, Acharya S, et al. Learning ecosystem-scale dynamics from microbiome data with MDSINE2. Nature Microbiology 2025. https://www.nature.com/articles/s41564-025-02112-6</w:t>
+      </w:r>
+    </w:p>
+    <w:p>
+      <w:pPr>
+        <w:spacing w:after="120"/>
+        <w:jc w:val="both"/>
+      </w:pPr>
+      <w:r>
+        <w:t>Madin JS, Nielsen DA, Brbic M, et al. A synthesis of bacterial and archaeal phenotypic trait data. Scientific Data 2020;7:170.</w:t>
+      </w:r>
+    </w:p>
+    <w:p>
+      <w:pPr>
+        <w:spacing w:after="120"/>
+        <w:jc w:val="both"/>
+      </w:pPr>
+      <w:r>
+        <w:t>Parks DH, Chuvochina M, Rinke C, et al. GTDB: an ongoing census of bacterial and archaeal diversity through a phylogenetically consistent, rank normalized and complete genome-based taxonomy. Nucleic Acids Res 2022.</w:t>
       </w:r>
     </w:p>
     <w:p>

</xml_diff>

<commit_message>
Paper v6: KEGG genomic replication of anaerobe-keystone + GAI equation; 19 equations; pdfinfo 26 pages
</commit_message>
<xml_diff>
--- a/paper/mega27-04-microbiome-twin-paper.docx
+++ b/paper/mega27-04-microbiome-twin-paper.docx
@@ -60,7 +60,7 @@
         <w:jc w:val="both"/>
       </w:pPr>
       <w:r>
-        <w:t>(6) Exploratory keystone analysis names one candidate, the anaerobe-keystone hypothesis: across 156 studies, genera made of strict anaerobes are more often network hubs within the same study (study fixed-effect logit, p = 1.4e-4), independent of abundance and prevalence, and sulfate reducers are enriched under both NCBI and GTDB taxonomies (q = 0.02). No single biome passes FDR and keystones come from inferred networks, so this is a falsifiable candidate, not a discovery.</w:t>
+        <w:t>(6) Exploratory keystone analysis names one candidate, the anaerobe-keystone hypothesis: across 156 studies, genera made of strict anaerobes are more often network hubs within the same study (study fixed-effect logit, p = 1.4e-4), independent of abundance and prevalence, and sulfate reducers are enriched under both NCBI and GTDB taxonomies (q = 0.02); a KEGG genomic anaerobe index replicates it (p = 7e-8). No single biome passes FDR and keystones come from inferred networks, so this is a falsifiable candidate, not a discovery.</w:t>
       </w:r>
     </w:p>
     <w:p>
@@ -5902,6 +5902,40 @@
       </w:r>
     </w:p>
     <w:p>
+      <w:pPr>
+        <w:spacing w:after="120"/>
+        <w:jc w:val="both"/>
+      </w:pPr>
+      <w:r>
+        <w:t>Genomic replication (KEGG). To avoid relying on one phenotype database, we scored marker genes across 11,951 KEGG genomes (203 of 248 genera mapped): pyruvate:ferredoxin oxidoreductase (PFOR; K00169 or K03737), [FeFe]-hydrogenase, complete dissimilatory sulfate reduction (dsrA, dsrB and aprA), aa3 cytochrome c oxidase (coxA, K02274), catalase and cytochrome bd. The genomic anaerobe index is</w:t>
+      </w:r>
+    </w:p>
+    <w:p>
+      <w:pPr>
+        <w:jc w:val="center"/>
+      </w:pPr>
+      <w:r>
+        <w:rPr>
+          <w:i/>
+        </w:rPr>
+        <w:t>GAI_j = (1/|g_j|) sum_{x in g_j} 1[PFOR in x]  -  (1/|g_j|) sum_{x in g_j} 1[coxA in x]</w:t>
+      </w:r>
+      <w:r>
+        <w:tab/>
+        <w:tab/>
+        <w:t>(18)</w:t>
+      </w:r>
+    </w:p>
+    <w:p>
+      <w:pPr>
+        <w:spacing w:after="120"/>
+        <w:jc w:val="both"/>
+      </w:pPr>
+      <w:r>
+        <w:t>It agrees with the Madin anaerobe share (Spearman 0.84) and tracks keystone frequency (rho = 0.36, p = 9e-08). In the within-study fixed-effect logit with abundance and prevalence (13,294 rows, 159 studies), GAI has coefficient 0.32 (p = 7e-08). Most of this is the absence of aerobic respiration (coxA -0.52, p = 6e-06; PFOR alone p = 0.08), plus complete sulfate reduction (+0.70, p = 3e-05).</w:t>
+      </w:r>
+    </w:p>
+    <w:p>
       <w:r>
         <w:rPr>
           <w:b/>
@@ -6430,7 +6464,7 @@
       <w:r>
         <w:tab/>
         <w:tab/>
-        <w:t>(18)</w:t>
+        <w:t>(19)</w:t>
       </w:r>
     </w:p>
     <w:p>
@@ -7123,7 +7157,7 @@
         <w:rPr>
           <w:b/>
         </w:rPr>
-        <w:t>Table 11. Tools ledger: 21 entries, 16 counting toward the gate after excluding infrastructure.</w:t>
+        <w:t>Table 11. Tools ledger: 22 entries, 17 counting toward the gate after excluding infrastructure.</w:t>
       </w:r>
     </w:p>
     <w:tbl>
@@ -8048,6 +8082,48 @@
           <w:p>
             <w:r>
               <w:t>scripts/keystone_traits.py</w:t>
+            </w:r>
+          </w:p>
+        </w:tc>
+        <w:tc>
+          <w:tcPr>
+            <w:tcW w:type="dxa" w:w="2160"/>
+          </w:tcPr>
+          <w:p>
+            <w:r>
+              <w:t>counts</w:t>
+            </w:r>
+          </w:p>
+        </w:tc>
+      </w:tr>
+      <w:tr>
+        <w:tc>
+          <w:tcPr>
+            <w:tcW w:type="dxa" w:w="2160"/>
+          </w:tcPr>
+          <w:p>
+            <w:r>
+              <w:t>KEGG REST (genome list + KO-gene links)</w:t>
+            </w:r>
+          </w:p>
+        </w:tc>
+        <w:tc>
+          <w:tcPr>
+            <w:tcW w:type="dxa" w:w="2160"/>
+          </w:tcPr>
+          <w:p>
+            <w:r>
+              <w:t>database</w:t>
+            </w:r>
+          </w:p>
+        </w:tc>
+        <w:tc>
+          <w:tcPr>
+            <w:tcW w:type="dxa" w:w="2160"/>
+          </w:tcPr>
+          <w:p>
+            <w:r>
+              <w:t>scripts/keystone_kegg.py</w:t>
             </w:r>
           </w:p>
         </w:tc>
@@ -16515,6 +16591,15 @@
       </w:pPr>
       <w:r>
         <w:t>Gibson TE, Kim Y, Acharya S, et al. Learning ecosystem-scale dynamics from microbiome data with MDSINE2. Nature Microbiology 2025. https://www.nature.com/articles/s41564-025-02112-6</w:t>
+      </w:r>
+    </w:p>
+    <w:p>
+      <w:pPr>
+        <w:spacing w:after="120"/>
+        <w:jc w:val="both"/>
+      </w:pPr>
+      <w:r>
+        <w:t>Kanehisa M, Furumichi M, Sato Y, et al. KEGG for taxonomy-based analysis of pathways and genomes. Nucleic Acids Res 2023.</w:t>
       </w:r>
     </w:p>
     <w:p>

</xml_diff>

<commit_message>
Paper v7: BV-BRC third-source replication; pdfinfo 27 pages
</commit_message>
<xml_diff>
--- a/paper/mega27-04-microbiome-twin-paper.docx
+++ b/paper/mega27-04-microbiome-twin-paper.docx
@@ -5936,6 +5936,15 @@
       </w:r>
     </w:p>
     <w:p>
+      <w:pPr>
+        <w:spacing w:after="120"/>
+        <w:jc w:val="both"/>
+      </w:pPr>
+      <w:r>
+        <w:t>Third source (BV-BRC). Oxygen-requirement annotations of 11,323 BV-BRC genomes cover 102 keystone genera (&gt;= 3 annotated genomes). Their anaerobe share agrees with Madin (rho = 0.83) and KEGG GAI (rho = 0.81), tracks keystone frequency (rho = 0.34, p = 6e-04), and keeps its effect in the fixed-effect logit (coefficient 0.44, p = 6e-04; 6,804 rows, 151 studies). The three trait sources overlap partly in their curated inputs, so they are not fully independent.</w:t>
+      </w:r>
+    </w:p>
+    <w:p>
       <w:r>
         <w:rPr>
           <w:b/>
@@ -7157,7 +7166,7 @@
         <w:rPr>
           <w:b/>
         </w:rPr>
-        <w:t>Table 11. Tools ledger: 22 entries, 17 counting toward the gate after excluding infrastructure.</w:t>
+        <w:t>Table 11. Tools ledger: 23 entries, 18 counting toward the gate after excluding infrastructure.</w:t>
       </w:r>
     </w:p>
     <w:tbl>
@@ -8124,6 +8133,48 @@
           <w:p>
             <w:r>
               <w:t>scripts/keystone_kegg.py</w:t>
+            </w:r>
+          </w:p>
+        </w:tc>
+        <w:tc>
+          <w:tcPr>
+            <w:tcW w:type="dxa" w:w="2160"/>
+          </w:tcPr>
+          <w:p>
+            <w:r>
+              <w:t>counts</w:t>
+            </w:r>
+          </w:p>
+        </w:tc>
+      </w:tr>
+      <w:tr>
+        <w:tc>
+          <w:tcPr>
+            <w:tcW w:type="dxa" w:w="2160"/>
+          </w:tcPr>
+          <w:p>
+            <w:r>
+              <w:t>BV-BRC genome API (oxygen_requirement facets)</w:t>
+            </w:r>
+          </w:p>
+        </w:tc>
+        <w:tc>
+          <w:tcPr>
+            <w:tcW w:type="dxa" w:w="2160"/>
+          </w:tcPr>
+          <w:p>
+            <w:r>
+              <w:t>database</w:t>
+            </w:r>
+          </w:p>
+        </w:tc>
+        <w:tc>
+          <w:tcPr>
+            <w:tcW w:type="dxa" w:w="2160"/>
+          </w:tcPr>
+          <w:p>
+            <w:r>
+              <w:t>scripts/keystone_bvbrc.py</w:t>
             </w:r>
           </w:p>
         </w:tc>
@@ -16600,6 +16651,15 @@
       </w:pPr>
       <w:r>
         <w:t>Kanehisa M, Furumichi M, Sato Y, et al. KEGG for taxonomy-based analysis of pathways and genomes. Nucleic Acids Res 2023.</w:t>
+      </w:r>
+    </w:p>
+    <w:p>
+      <w:pPr>
+        <w:spacing w:after="120"/>
+        <w:jc w:val="both"/>
+      </w:pPr>
+      <w:r>
+        <w:t>Olson RD, Assaf R, Brettin T, et al. Introducing the Bacterial and Viral Bioinformatics Resource Center (BV-BRC). Nucleic Acids Res 2023.</w:t>
       </w:r>
     </w:p>
     <w:p>

</xml_diff>